<commit_message>
3 hónapos szolgáltatás statisztika bevezetése és UI, Dokumentáció fejlesztése
Backend:

 - Új TreatmentController::serviceStatsLast3Months metódus (elmúlt 3 hónap szolgáltatásainak összesítése)
    (kezelésenként egyszer számol, a piece mezőt figyelmen kívül hagyja, csökkenő sorrendben)
 - Új endpoint: GET /treatments/me/service-stats-3months
 - A stats válaszból a fix next_visit mező eltávolítása

Frontend:
 - Szolgáltatás statisztika lekérése és megjelenítése a UserHome oldalon
 - Reszponzív grid lista darabszám badge-ekkel
 - Új stílusok hozzáadása (App.css)

UI módosítások:
 - Login elfelejtett jelszó modal footer és gomb osztályok frissítése
 - ResponsiveSidebar nav-link fókusz stílus javítása
 - DeleteTreatmentModal-ban a törlés megerősítés üzenet átformázása

Dokumentáció:
- docs/BBSBackendDatas.sql fájl hozzáadása
- SQL export frissítése
 - Elavult dokumentációk törlése
 - Felhasználói dokumentáció projekt futtatásának javítása
</commit_message>
<xml_diff>
--- a/docs/BalatonBeautySalon_felhasznaloi_dokumentacio.docx
+++ b/docs/BalatonBeautySalon_felhasznaloi_dokumentacio.docx
@@ -1,6 +1,6 @@
 
 <file path=word/document.xml><?xml version="1.0" encoding="utf-8"?>
-<w:document xmlns:wpc="http://schemas.microsoft.com/office/word/2010/wordprocessingCanvas" xmlns:cx="http://schemas.microsoft.com/office/drawing/2014/chartex" xmlns:cx1="http://schemas.microsoft.com/office/drawing/2015/9/8/chartex" xmlns:cx2="http://schemas.microsoft.com/office/drawing/2015/10/21/chartex" xmlns:cx3="http://schemas.microsoft.com/office/drawing/2016/5/9/chartex" xmlns:cx4="http://schemas.microsoft.com/office/drawing/2016/5/10/chartex" xmlns:cx5="http://schemas.microsoft.com/office/drawing/2016/5/11/chartex" xmlns:cx6="http://schemas.microsoft.com/office/drawing/2016/5/12/chartex" xmlns:cx7="http://schemas.microsoft.com/office/drawing/2016/5/13/chartex" xmlns:cx8="http://schemas.microsoft.com/office/drawing/2016/5/14/chartex" xmlns:mc="http://schemas.openxmlformats.org/markup-compatibility/2006" xmlns:aink="http://schemas.microsoft.com/office/drawing/2016/ink" xmlns:am3d="http://schemas.microsoft.com/office/drawing/2017/model3d" xmlns:o="urn:schemas-microsoft-com:office:office" xmlns:r="http://schemas.openxmlformats.org/officeDocument/2006/relationships" xmlns:m="http://schemas.openxmlformats.org/officeDocument/2006/math" xmlns:v="urn:schemas-microsoft-com:vml" xmlns:wp14="http://schemas.microsoft.com/office/word/2010/wordprocessingDrawing" xmlns:wp="http://schemas.openxmlformats.org/drawingml/2006/wordprocessingDrawing" xmlns:w10="urn:schemas-microsoft-com:office:word" xmlns:w="http://schemas.openxmlformats.org/wordprocessingml/2006/main" xmlns:w14="http://schemas.microsoft.com/office/word/2010/wordml" xmlns:w15="http://schemas.microsoft.com/office/word/2012/wordml" xmlns:w16cex="http://schemas.microsoft.com/office/word/2018/wordml/cex" xmlns:w16cid="http://schemas.microsoft.com/office/word/2016/wordml/cid" xmlns:w16="http://schemas.microsoft.com/office/word/2018/wordml" xmlns:w16sdtdh="http://schemas.microsoft.com/office/word/2020/wordml/sdtdatahash" xmlns:w16se="http://schemas.microsoft.com/office/word/2015/wordml/symex" xmlns:wpg="http://schemas.microsoft.com/office/word/2010/wordprocessingGroup" xmlns:wpi="http://schemas.microsoft.com/office/word/2010/wordprocessingInk" xmlns:wne="http://schemas.microsoft.com/office/word/2006/wordml" xmlns:wps="http://schemas.microsoft.com/office/word/2010/wordprocessingShape" mc:Ignorable="w14 w15 w16se w16cid w16 w16cex w16sdtdh wp14">
+<w:document xmlns:wpc="http://schemas.microsoft.com/office/word/2010/wordprocessingCanvas" xmlns:cx="http://schemas.microsoft.com/office/drawing/2014/chartex" xmlns:cx1="http://schemas.microsoft.com/office/drawing/2015/9/8/chartex" xmlns:cx2="http://schemas.microsoft.com/office/drawing/2015/10/21/chartex" xmlns:cx3="http://schemas.microsoft.com/office/drawing/2016/5/9/chartex" xmlns:cx4="http://schemas.microsoft.com/office/drawing/2016/5/10/chartex" xmlns:cx5="http://schemas.microsoft.com/office/drawing/2016/5/11/chartex" xmlns:cx6="http://schemas.microsoft.com/office/drawing/2016/5/12/chartex" xmlns:cx7="http://schemas.microsoft.com/office/drawing/2016/5/13/chartex" xmlns:cx8="http://schemas.microsoft.com/office/drawing/2016/5/14/chartex" xmlns:mc="http://schemas.openxmlformats.org/markup-compatibility/2006" xmlns:aink="http://schemas.microsoft.com/office/drawing/2016/ink" xmlns:am3d="http://schemas.microsoft.com/office/drawing/2017/model3d" xmlns:o="urn:schemas-microsoft-com:office:office" xmlns:oel="http://schemas.microsoft.com/office/2019/extlst" xmlns:r="http://schemas.openxmlformats.org/officeDocument/2006/relationships" xmlns:m="http://schemas.openxmlformats.org/officeDocument/2006/math" xmlns:v="urn:schemas-microsoft-com:vml" xmlns:wp14="http://schemas.microsoft.com/office/word/2010/wordprocessingDrawing" xmlns:wp="http://schemas.openxmlformats.org/drawingml/2006/wordprocessingDrawing" xmlns:w10="urn:schemas-microsoft-com:office:word" xmlns:w="http://schemas.openxmlformats.org/wordprocessingml/2006/main" xmlns:w14="http://schemas.microsoft.com/office/word/2010/wordml" xmlns:w15="http://schemas.microsoft.com/office/word/2012/wordml" xmlns:w16cex="http://schemas.microsoft.com/office/word/2018/wordml/cex" xmlns:w16cid="http://schemas.microsoft.com/office/word/2016/wordml/cid" xmlns:w16="http://schemas.microsoft.com/office/word/2018/wordml" xmlns:w16du="http://schemas.microsoft.com/office/word/2023/wordml/word16du" xmlns:w16sdtdh="http://schemas.microsoft.com/office/word/2020/wordml/sdtdatahash" xmlns:w16sdtfl="http://schemas.microsoft.com/office/word/2024/wordml/sdtformatlock" xmlns:w16se="http://schemas.microsoft.com/office/word/2015/wordml/symex" xmlns:wpg="http://schemas.microsoft.com/office/word/2010/wordprocessingGroup" xmlns:wpi="http://schemas.microsoft.com/office/word/2010/wordprocessingInk" xmlns:wne="http://schemas.microsoft.com/office/word/2006/wordml" xmlns:wps="http://schemas.microsoft.com/office/word/2010/wordprocessingShape" mc:Ignorable="w14 w15 w16se w16cid w16 w16cex w16sdtdh w16sdtfl w16du wp14">
   <w:body>
     <w:p>
       <w:pPr>
@@ -1593,19 +1593,7 @@
           <w:szCs w:val="36"/>
           <w:u w:val="single"/>
         </w:rPr>
-        <w:t>Projekt indítása</w:t>
-      </w:r>
-      <w:r>
-        <w:rPr>
-          <w:rFonts w:ascii="Aptos" w:eastAsia="Aptos" w:hAnsi="Aptos" w:cs="Aptos"/>
-          <w:b/>
-          <w:bCs/>
-          <w:color w:val="000000" w:themeColor="text1"/>
-          <w:sz w:val="36"/>
-          <w:szCs w:val="36"/>
-          <w:u w:val="single"/>
-        </w:rPr>
-        <w:t>:</w:t>
+        <w:t>Projekt indítása:</w:t>
       </w:r>
     </w:p>
     <w:p>
@@ -1751,83 +1739,605 @@
         <w:rPr>
           <w:b/>
           <w:bCs/>
-          <w:sz w:val="32"/>
-          <w:szCs w:val="32"/>
           <w:u w:val="single"/>
         </w:rPr>
       </w:pPr>
+      <w:r>
+        <w:rPr>
+          <w:b/>
+          <w:bCs/>
+          <w:u w:val="single"/>
+        </w:rPr>
+        <w:t>Indítás folyamata:</w:t>
+      </w:r>
+    </w:p>
+    <w:p>
+      <w:pPr>
+        <w:pStyle w:val="Listaszerbekezds"/>
+        <w:numPr>
+          <w:ilvl w:val="0"/>
+          <w:numId w:val="28"/>
+        </w:numPr>
+      </w:pPr>
+      <w:r>
+        <w:t xml:space="preserve">XAMPP </w:t>
+      </w:r>
       <w:proofErr w:type="spellStart"/>
       <w:r>
-        <w:rPr>
-          <w:b/>
-          <w:bCs/>
-          <w:sz w:val="32"/>
-          <w:szCs w:val="32"/>
+        <w:t>Control</w:t>
+      </w:r>
+      <w:proofErr w:type="spellEnd"/>
+      <w:r>
+        <w:t xml:space="preserve"> Panel megnyitása</w:t>
+      </w:r>
+      <w:r>
+        <w:t>.</w:t>
+      </w:r>
+    </w:p>
+    <w:p>
+      <w:pPr>
+        <w:pStyle w:val="Listaszerbekezds"/>
+        <w:numPr>
+          <w:ilvl w:val="0"/>
+          <w:numId w:val="28"/>
+        </w:numPr>
+      </w:pPr>
+      <w:proofErr w:type="spellStart"/>
+      <w:r>
+        <w:t>Apache</w:t>
+      </w:r>
+      <w:proofErr w:type="spellEnd"/>
+      <w:r>
+        <w:t xml:space="preserve"> és </w:t>
+      </w:r>
+      <w:proofErr w:type="spellStart"/>
+      <w:r>
+        <w:t>MySQL</w:t>
+      </w:r>
+      <w:proofErr w:type="spellEnd"/>
+      <w:r>
+        <w:t xml:space="preserve"> elindítása a „Start” gombbal</w:t>
+      </w:r>
+      <w:r>
+        <w:t>.</w:t>
+      </w:r>
+    </w:p>
+    <w:p>
+      <w:pPr>
+        <w:pStyle w:val="Listaszerbekezds"/>
+        <w:numPr>
+          <w:ilvl w:val="0"/>
+          <w:numId w:val="28"/>
+        </w:numPr>
+      </w:pPr>
+      <w:r>
+        <w:t>Projekt</w:t>
+      </w:r>
+      <w:r>
+        <w:t xml:space="preserve"> mappa megnyitása</w:t>
+      </w:r>
+      <w:r>
+        <w:t xml:space="preserve"> Visual </w:t>
+      </w:r>
+      <w:proofErr w:type="spellStart"/>
+      <w:r>
+        <w:t>Studio</w:t>
+      </w:r>
+      <w:proofErr w:type="spellEnd"/>
+      <w:r>
+        <w:t xml:space="preserve"> </w:t>
+      </w:r>
+      <w:proofErr w:type="spellStart"/>
+      <w:r>
+        <w:t>Code</w:t>
+      </w:r>
+      <w:proofErr w:type="spellEnd"/>
+      <w:r>
+        <w:t xml:space="preserve"> -</w:t>
+      </w:r>
+      <w:proofErr w:type="spellStart"/>
+      <w:r>
+        <w:t>al</w:t>
+      </w:r>
+      <w:proofErr w:type="spellEnd"/>
+      <w:r>
+        <w:t>.</w:t>
+      </w:r>
+    </w:p>
+    <w:p>
+      <w:pPr>
+        <w:pStyle w:val="Listaszerbekezds"/>
+        <w:numPr>
+          <w:ilvl w:val="0"/>
+          <w:numId w:val="28"/>
+        </w:numPr>
+      </w:pPr>
+      <w:r>
+        <w:t>Két terminál megnyitása</w:t>
+      </w:r>
+      <w:r>
+        <w:t>.</w:t>
+      </w:r>
+    </w:p>
+    <w:p>
+      <w:pPr>
+        <w:pStyle w:val="Listaszerbekezds"/>
+        <w:numPr>
+          <w:ilvl w:val="0"/>
+          <w:numId w:val="28"/>
+        </w:numPr>
+        <w:rPr>
           <w:u w:val="single"/>
         </w:rPr>
-        <w:t>Laravelben</w:t>
+      </w:pPr>
+      <w:r>
+        <w:rPr>
+          <w:u w:val="single"/>
+        </w:rPr>
+        <w:t>Első terminál utasításai</w:t>
+      </w:r>
+      <w:r>
+        <w:rPr>
+          <w:u w:val="single"/>
+        </w:rPr>
+        <w:t xml:space="preserve"> (Backend)</w:t>
+      </w:r>
+      <w:r>
+        <w:rPr>
+          <w:u w:val="single"/>
+        </w:rPr>
+        <w:t>:</w:t>
+      </w:r>
+    </w:p>
+    <w:p>
+      <w:pPr>
+        <w:pStyle w:val="Listaszerbekezds"/>
+        <w:numPr>
+          <w:ilvl w:val="1"/>
+          <w:numId w:val="30"/>
+        </w:numPr>
+        <w:rPr>
+          <w:u w:val="single"/>
+        </w:rPr>
+      </w:pPr>
+      <w:r>
+        <w:rPr>
+          <w:b/>
+          <w:bCs/>
+        </w:rPr>
+        <w:t xml:space="preserve">cd </w:t>
+      </w:r>
+      <w:proofErr w:type="spellStart"/>
+      <w:r>
+        <w:rPr>
+          <w:b/>
+          <w:bCs/>
+        </w:rPr>
+        <w:t>BBSbackend</w:t>
       </w:r>
       <w:proofErr w:type="spellEnd"/>
-      <w:r>
-        <w:rPr>
-          <w:b/>
-          <w:bCs/>
-          <w:sz w:val="32"/>
-          <w:szCs w:val="32"/>
+    </w:p>
+    <w:p>
+      <w:pPr>
+        <w:pStyle w:val="Listaszerbekezds"/>
+        <w:numPr>
+          <w:ilvl w:val="1"/>
+          <w:numId w:val="30"/>
+        </w:numPr>
+        <w:rPr>
           <w:u w:val="single"/>
         </w:rPr>
-        <w:t>:</w:t>
-      </w:r>
-    </w:p>
-    <w:p>
-      <w:pPr>
-        <w:rPr>
-          <w:b/>
-          <w:bCs/>
-        </w:rPr>
-      </w:pPr>
-      <w:r>
-        <w:rPr>
-          <w:b/>
-          <w:bCs/>
-        </w:rPr>
-        <w:t>1. Projekt megnyitása:</w:t>
-      </w:r>
-    </w:p>
-    <w:p>
-      <w:pPr>
-        <w:ind w:firstLine="708"/>
-      </w:pPr>
-      <w:r>
+      </w:pPr>
+      <w:proofErr w:type="spellStart"/>
+      <w:r>
+        <w:rPr>
+          <w:b/>
+          <w:bCs/>
+        </w:rPr>
+        <w:t>composer</w:t>
+      </w:r>
+      <w:proofErr w:type="spellEnd"/>
+      <w:r>
+        <w:rPr>
+          <w:b/>
+          <w:bCs/>
+        </w:rPr>
+        <w:t xml:space="preserve"> </w:t>
+      </w:r>
+      <w:proofErr w:type="spellStart"/>
+      <w:r>
+        <w:rPr>
+          <w:b/>
+          <w:bCs/>
+        </w:rPr>
+        <w:t>install</w:t>
+      </w:r>
+      <w:proofErr w:type="spellEnd"/>
+    </w:p>
+    <w:p>
+      <w:pPr>
+        <w:pStyle w:val="Listaszerbekezds"/>
+        <w:numPr>
+          <w:ilvl w:val="0"/>
+          <w:numId w:val="29"/>
+        </w:numPr>
+      </w:pPr>
+      <w:proofErr w:type="gramStart"/>
+      <w:r>
+        <w:t xml:space="preserve">A </w:t>
+      </w:r>
+      <w:r>
+        <w:rPr>
+          <w:b/>
+          <w:bCs/>
+        </w:rPr>
+        <w:t>.</w:t>
+      </w:r>
+      <w:proofErr w:type="spellStart"/>
+      <w:r>
+        <w:rPr>
+          <w:b/>
+          <w:bCs/>
+        </w:rPr>
+        <w:t>env</w:t>
+      </w:r>
+      <w:proofErr w:type="gramEnd"/>
+      <w:r>
+        <w:rPr>
+          <w:b/>
+          <w:bCs/>
+        </w:rPr>
+        <w:t>.example</w:t>
+      </w:r>
+      <w:proofErr w:type="spellEnd"/>
+      <w:r>
+        <w:t xml:space="preserve"> file nevéből a </w:t>
+      </w:r>
+      <w:r>
+        <w:rPr>
+          <w:b/>
+          <w:bCs/>
+        </w:rPr>
+        <w:t>.</w:t>
+      </w:r>
+      <w:proofErr w:type="spellStart"/>
+      <w:r>
+        <w:rPr>
+          <w:b/>
+          <w:bCs/>
+        </w:rPr>
+        <w:t>example</w:t>
+      </w:r>
+      <w:proofErr w:type="spellEnd"/>
+      <w:r>
+        <w:t xml:space="preserve"> törlése</w:t>
+      </w:r>
+      <w:r>
+        <w:t>.</w:t>
+      </w:r>
+    </w:p>
+    <w:p>
+      <w:pPr>
+        <w:pStyle w:val="Listaszerbekezds"/>
+        <w:numPr>
+          <w:ilvl w:val="0"/>
+          <w:numId w:val="29"/>
+        </w:numPr>
+      </w:pPr>
+      <w:r>
+        <w:t xml:space="preserve">Első terminálban adatbázis migráció futtatása a </w:t>
+      </w:r>
+      <w:r>
+        <w:rPr>
+          <w:b/>
+          <w:bCs/>
+        </w:rPr>
+        <w:t xml:space="preserve">php </w:t>
+      </w:r>
+      <w:proofErr w:type="spellStart"/>
+      <w:r>
+        <w:rPr>
+          <w:b/>
+          <w:bCs/>
+        </w:rPr>
+        <w:t>artisan</w:t>
+      </w:r>
+      <w:proofErr w:type="spellEnd"/>
+      <w:r>
+        <w:rPr>
+          <w:b/>
+          <w:bCs/>
+        </w:rPr>
+        <w:t xml:space="preserve"> </w:t>
+      </w:r>
+      <w:proofErr w:type="spellStart"/>
+      <w:r>
+        <w:rPr>
+          <w:b/>
+          <w:bCs/>
+        </w:rPr>
+        <w:t>migrate</w:t>
+      </w:r>
+      <w:proofErr w:type="spellEnd"/>
+      <w:r>
+        <w:rPr>
+          <w:b/>
+          <w:bCs/>
+        </w:rPr>
+        <w:t xml:space="preserve"> </w:t>
+      </w:r>
+      <w:r>
+        <w:t xml:space="preserve">majd a terminálban </w:t>
+      </w:r>
+      <w:proofErr w:type="spellStart"/>
+      <w:r>
+        <w:rPr>
+          <w:b/>
+          <w:bCs/>
+        </w:rPr>
+        <w:t>yes</w:t>
+      </w:r>
+      <w:proofErr w:type="spellEnd"/>
+      <w:r>
+        <w:rPr>
+          <w:b/>
+          <w:bCs/>
+        </w:rPr>
+        <w:t xml:space="preserve"> </w:t>
+      </w:r>
+      <w:r>
+        <w:t>válasz adásával</w:t>
+      </w:r>
+      <w:r>
+        <w:t>.</w:t>
+      </w:r>
+    </w:p>
+    <w:p>
+      <w:pPr>
+        <w:pStyle w:val="Listaszerbekezds"/>
+        <w:numPr>
+          <w:ilvl w:val="0"/>
+          <w:numId w:val="29"/>
+        </w:numPr>
+      </w:pPr>
+      <w:r>
+        <w:t xml:space="preserve">A </w:t>
+      </w:r>
+      <w:proofErr w:type="spellStart"/>
+      <w:r>
+        <w:rPr>
+          <w:b/>
+          <w:bCs/>
+        </w:rPr>
+        <w:t>localhost</w:t>
+      </w:r>
+      <w:proofErr w:type="spellEnd"/>
+      <w:r>
+        <w:rPr>
+          <w:b/>
+          <w:bCs/>
+        </w:rPr>
+        <w:t>/</w:t>
+      </w:r>
+      <w:proofErr w:type="spellStart"/>
+      <w:r>
+        <w:rPr>
+          <w:b/>
+          <w:bCs/>
+        </w:rPr>
+        <w:t>phpmyadmin</w:t>
+      </w:r>
+      <w:proofErr w:type="spellEnd"/>
+      <w:r>
+        <w:rPr>
+          <w:b/>
+          <w:bCs/>
+        </w:rPr>
+        <w:t xml:space="preserve"> </w:t>
+      </w:r>
+      <w:r>
+        <w:t xml:space="preserve">oldalon a </w:t>
+      </w:r>
+      <w:proofErr w:type="spellStart"/>
+      <w:r>
+        <w:rPr>
+          <w:b/>
+          <w:bCs/>
+        </w:rPr>
+        <w:t>bbsbackend</w:t>
+      </w:r>
+      <w:proofErr w:type="spellEnd"/>
+      <w:r>
+        <w:rPr>
+          <w:b/>
+          <w:bCs/>
+        </w:rPr>
+        <w:t xml:space="preserve"> </w:t>
+      </w:r>
+      <w:r>
+        <w:t xml:space="preserve">adatbázis megnyitása, majd </w:t>
+      </w:r>
+      <w:r>
+        <w:t xml:space="preserve">az importálás menüpontban a </w:t>
+      </w:r>
+      <w:proofErr w:type="spellStart"/>
+      <w:r>
+        <w:rPr>
+          <w:b/>
+          <w:bCs/>
+        </w:rPr>
+        <w:t>projektmabba</w:t>
+      </w:r>
+      <w:proofErr w:type="spellEnd"/>
+      <w:r>
+        <w:rPr>
+          <w:b/>
+          <w:bCs/>
+        </w:rPr>
+        <w:t>/</w:t>
+      </w:r>
+      <w:proofErr w:type="spellStart"/>
+      <w:r>
+        <w:rPr>
+          <w:b/>
+          <w:bCs/>
+        </w:rPr>
+        <w:t>docs</w:t>
+      </w:r>
+      <w:proofErr w:type="spellEnd"/>
+      <w:r>
+        <w:rPr>
+          <w:b/>
+          <w:bCs/>
+        </w:rPr>
+        <w:t>/</w:t>
+      </w:r>
+      <w:proofErr w:type="spellStart"/>
+      <w:r>
+        <w:rPr>
+          <w:b/>
+          <w:bCs/>
+        </w:rPr>
+        <w:t>BBSBackendDatas</w:t>
+      </w:r>
+      <w:r>
+        <w:rPr>
+          <w:b/>
+          <w:bCs/>
+        </w:rPr>
+        <w:t>.sql</w:t>
+      </w:r>
+      <w:proofErr w:type="spellEnd"/>
+      <w:r>
+        <w:rPr>
+          <w:b/>
+          <w:bCs/>
+        </w:rPr>
+        <w:t xml:space="preserve"> </w:t>
+      </w:r>
+      <w:proofErr w:type="gramStart"/>
+      <w:r>
+        <w:t>importálása</w:t>
+      </w:r>
+      <w:r>
+        <w:t>,.</w:t>
+      </w:r>
+      <w:proofErr w:type="gramEnd"/>
+    </w:p>
+    <w:p>
+      <w:pPr>
+        <w:pStyle w:val="Listaszerbekezds"/>
+        <w:numPr>
+          <w:ilvl w:val="0"/>
+          <w:numId w:val="29"/>
+        </w:numPr>
+      </w:pPr>
+      <w:r>
+        <w:t xml:space="preserve">Backend futtatása az első terminálban a </w:t>
+      </w:r>
+      <w:r>
+        <w:rPr>
+          <w:b/>
+          <w:bCs/>
+        </w:rPr>
+        <w:t xml:space="preserve">php </w:t>
+      </w:r>
+      <w:proofErr w:type="spellStart"/>
+      <w:r>
+        <w:rPr>
+          <w:b/>
+          <w:bCs/>
+        </w:rPr>
+        <w:t>artisan</w:t>
+      </w:r>
+      <w:proofErr w:type="spellEnd"/>
+      <w:r>
+        <w:rPr>
+          <w:b/>
+          <w:bCs/>
+        </w:rPr>
+        <w:t xml:space="preserve"> </w:t>
+      </w:r>
+      <w:proofErr w:type="spellStart"/>
+      <w:r>
+        <w:rPr>
+          <w:b/>
+          <w:bCs/>
+        </w:rPr>
+        <w:t>serve</w:t>
+      </w:r>
+      <w:proofErr w:type="spellEnd"/>
+      <w:r>
+        <w:rPr>
+          <w:b/>
+          <w:bCs/>
+        </w:rPr>
+        <w:t xml:space="preserve"> </w:t>
+      </w:r>
+      <w:r>
+        <w:t>parancs futtatásával.</w:t>
+      </w:r>
+    </w:p>
+    <w:p>
+      <w:pPr>
+        <w:pStyle w:val="Listaszerbekezds"/>
+        <w:numPr>
+          <w:ilvl w:val="0"/>
+          <w:numId w:val="29"/>
+        </w:numPr>
+      </w:pPr>
+      <w:r>
+        <w:t>A második terminál utasításai (Frontend):</w:t>
+      </w:r>
+    </w:p>
+    <w:p>
+      <w:pPr>
+        <w:pStyle w:val="Listaszerbekezds"/>
+        <w:numPr>
+          <w:ilvl w:val="1"/>
+          <w:numId w:val="31"/>
+        </w:numPr>
+        <w:rPr>
+          <w:b/>
+          <w:bCs/>
+        </w:rPr>
+      </w:pPr>
+      <w:r>
+        <w:rPr>
+          <w:b/>
+          <w:bCs/>
+        </w:rPr>
         <w:t xml:space="preserve">cd </w:t>
       </w:r>
       <w:proofErr w:type="spellStart"/>
       <w:r>
-        <w:t>bbsbackend</w:t>
+        <w:rPr>
+          <w:b/>
+          <w:bCs/>
+        </w:rPr>
+        <w:t>BBSfrontend</w:t>
       </w:r>
       <w:proofErr w:type="spellEnd"/>
     </w:p>
     <w:p>
       <w:pPr>
-        <w:rPr>
-          <w:b/>
-          <w:bCs/>
-        </w:rPr>
-      </w:pPr>
-      <w:r>
-        <w:rPr>
-          <w:b/>
-          <w:bCs/>
-        </w:rPr>
-        <w:t xml:space="preserve">2. </w:t>
-      </w:r>
+        <w:pStyle w:val="Listaszerbekezds"/>
+        <w:numPr>
+          <w:ilvl w:val="1"/>
+          <w:numId w:val="31"/>
+        </w:numPr>
+        <w:rPr>
+          <w:b/>
+          <w:bCs/>
+        </w:rPr>
+      </w:pPr>
       <w:proofErr w:type="spellStart"/>
       <w:r>
         <w:rPr>
           <w:b/>
           <w:bCs/>
         </w:rPr>
-        <w:t>Package</w:t>
+        <w:t>npm</w:t>
       </w:r>
       <w:proofErr w:type="spellEnd"/>
       <w:r>
@@ -1835,55 +2345,68 @@
           <w:b/>
           <w:bCs/>
         </w:rPr>
-        <w:t>-ek telepítése:</w:t>
-      </w:r>
-    </w:p>
-    <w:p>
-      <w:pPr>
-        <w:ind w:firstLine="708"/>
-      </w:pPr>
+        <w:t xml:space="preserve"> </w:t>
+      </w:r>
       <w:proofErr w:type="spellStart"/>
       <w:r>
-        <w:t>composer</w:t>
+        <w:rPr>
+          <w:b/>
+          <w:bCs/>
+        </w:rPr>
+        <w:t>install</w:t>
       </w:r>
       <w:proofErr w:type="spellEnd"/>
       <w:r>
+        <w:rPr>
+          <w:b/>
+          <w:bCs/>
+        </w:rPr>
         <w:t xml:space="preserve"> </w:t>
       </w:r>
+    </w:p>
+    <w:p>
+      <w:pPr>
+        <w:pStyle w:val="Listaszerbekezds"/>
+        <w:numPr>
+          <w:ilvl w:val="1"/>
+          <w:numId w:val="31"/>
+        </w:numPr>
+        <w:rPr>
+          <w:b/>
+          <w:bCs/>
+        </w:rPr>
+      </w:pPr>
       <w:proofErr w:type="spellStart"/>
       <w:r>
+        <w:rPr>
+          <w:b/>
+          <w:bCs/>
+        </w:rPr>
+        <w:t>npm</w:t>
+      </w:r>
+      <w:proofErr w:type="spellEnd"/>
+      <w:r>
+        <w:rPr>
+          <w:b/>
+          <w:bCs/>
+        </w:rPr>
+        <w:t xml:space="preserve"> </w:t>
+      </w:r>
+      <w:proofErr w:type="spellStart"/>
+      <w:r>
+        <w:rPr>
+          <w:b/>
+          <w:bCs/>
+        </w:rPr>
         <w:t>install</w:t>
       </w:r>
       <w:proofErr w:type="spellEnd"/>
-    </w:p>
-    <w:p>
-      <w:pPr>
-        <w:rPr>
-          <w:b/>
-          <w:bCs/>
-        </w:rPr>
-      </w:pPr>
-      <w:r>
-        <w:rPr>
-          <w:b/>
-          <w:bCs/>
-        </w:rPr>
-        <w:t xml:space="preserve">3. </w:t>
-      </w:r>
-      <w:r>
-        <w:rPr>
-          <w:b/>
-          <w:bCs/>
-        </w:rPr>
-        <w:t xml:space="preserve">Állítsd be az adatbázist </w:t>
-      </w:r>
-      <w:proofErr w:type="gramStart"/>
-      <w:r>
-        <w:rPr>
-          <w:b/>
-          <w:bCs/>
-        </w:rPr>
-        <w:t>(.</w:t>
+      <w:r>
+        <w:rPr>
+          <w:b/>
+          <w:bCs/>
+        </w:rPr>
+        <w:t xml:space="preserve"> </w:t>
       </w:r>
       <w:proofErr w:type="spellStart"/>
       <w:r>
@@ -1891,291 +2414,219 @@
           <w:b/>
           <w:bCs/>
         </w:rPr>
-        <w:t>env</w:t>
+        <w:t>axios</w:t>
       </w:r>
       <w:proofErr w:type="spellEnd"/>
-      <w:proofErr w:type="gramEnd"/>
-      <w:r>
-        <w:rPr>
-          <w:b/>
-          <w:bCs/>
-        </w:rPr>
-        <w:t xml:space="preserve"> fájl</w:t>
-      </w:r>
-      <w:r>
-        <w:rPr>
-          <w:b/>
-          <w:bCs/>
-        </w:rPr>
-        <w:t>ban</w:t>
-      </w:r>
-      <w:r>
-        <w:rPr>
-          <w:b/>
-          <w:bCs/>
-        </w:rPr>
-        <w:t>):</w:t>
-      </w:r>
-    </w:p>
-    <w:p>
-      <w:pPr>
-        <w:ind w:left="708"/>
-      </w:pPr>
-      <w:r>
-        <w:t>DB_CONNECTION=</w:t>
-      </w:r>
+    </w:p>
+    <w:p>
+      <w:pPr>
+        <w:pStyle w:val="Listaszerbekezds"/>
+        <w:numPr>
+          <w:ilvl w:val="1"/>
+          <w:numId w:val="31"/>
+        </w:numPr>
+        <w:rPr>
+          <w:b/>
+          <w:bCs/>
+        </w:rPr>
+      </w:pPr>
       <w:proofErr w:type="spellStart"/>
       <w:r>
-        <w:t>mysql</w:t>
+        <w:rPr>
+          <w:b/>
+          <w:bCs/>
+        </w:rPr>
+        <w:t>npm</w:t>
       </w:r>
       <w:proofErr w:type="spellEnd"/>
-    </w:p>
-    <w:p>
-      <w:pPr>
-        <w:ind w:left="708"/>
-      </w:pPr>
-      <w:r>
-        <w:t>DB_HOST=127.0.0.1</w:t>
-      </w:r>
-    </w:p>
-    <w:p>
-      <w:pPr>
-        <w:ind w:left="708"/>
-      </w:pPr>
-      <w:r>
-        <w:t>DB_PORT=3306</w:t>
-      </w:r>
-    </w:p>
-    <w:p>
-      <w:pPr>
-        <w:ind w:left="708"/>
-      </w:pPr>
-      <w:r>
-        <w:t>DB_DATABASE=</w:t>
+      <w:r>
+        <w:rPr>
+          <w:b/>
+          <w:bCs/>
+        </w:rPr>
+        <w:t xml:space="preserve"> </w:t>
       </w:r>
       <w:proofErr w:type="spellStart"/>
       <w:r>
-        <w:t>bbsbackend</w:t>
+        <w:rPr>
+          <w:b/>
+          <w:bCs/>
+        </w:rPr>
+        <w:t>install</w:t>
       </w:r>
       <w:proofErr w:type="spellEnd"/>
-    </w:p>
-    <w:p>
-      <w:pPr>
-        <w:ind w:left="708"/>
-      </w:pPr>
-      <w:r>
-        <w:t>DB_USERNAME=</w:t>
+      <w:r>
+        <w:rPr>
+          <w:b/>
+          <w:bCs/>
+        </w:rPr>
+        <w:t xml:space="preserve"> </w:t>
       </w:r>
       <w:proofErr w:type="spellStart"/>
       <w:r>
-        <w:t>root</w:t>
+        <w:rPr>
+          <w:b/>
+          <w:bCs/>
+        </w:rPr>
+        <w:t>bootstrap</w:t>
       </w:r>
       <w:proofErr w:type="spellEnd"/>
-    </w:p>
-    <w:p>
-      <w:pPr>
-        <w:ind w:left="708"/>
-      </w:pPr>
-      <w:r>
-        <w:t>DB_PASSWORD=</w:t>
-      </w:r>
-    </w:p>
-    <w:p>
-      <w:pPr>
-        <w:rPr>
-          <w:b/>
-          <w:bCs/>
-        </w:rPr>
-      </w:pPr>
-      <w:r>
-        <w:rPr>
-          <w:b/>
-          <w:bCs/>
-        </w:rPr>
-        <w:t>4</w:t>
-      </w:r>
-      <w:r>
-        <w:rPr>
-          <w:b/>
-          <w:bCs/>
-        </w:rPr>
-        <w:t>. Migrációk futtatása:</w:t>
-      </w:r>
-    </w:p>
-    <w:p>
-      <w:pPr>
-        <w:ind w:firstLine="708"/>
-      </w:pPr>
-      <w:r>
-        <w:t xml:space="preserve">php </w:t>
+      <w:r>
+        <w:rPr>
+          <w:b/>
+          <w:bCs/>
+        </w:rPr>
+        <w:t xml:space="preserve"> </w:t>
       </w:r>
       <w:proofErr w:type="spellStart"/>
       <w:r>
-        <w:t>artisan</w:t>
+        <w:rPr>
+          <w:b/>
+          <w:bCs/>
+        </w:rPr>
+        <w:t>react-bootstrap</w:t>
       </w:r>
       <w:proofErr w:type="spellEnd"/>
-      <w:r>
+    </w:p>
+    <w:p>
+      <w:pPr>
+        <w:pStyle w:val="Listaszerbekezds"/>
+        <w:numPr>
+          <w:ilvl w:val="1"/>
+          <w:numId w:val="31"/>
+        </w:numPr>
+        <w:rPr>
+          <w:b/>
+          <w:bCs/>
+        </w:rPr>
+      </w:pPr>
+      <w:proofErr w:type="spellStart"/>
+      <w:r>
+        <w:rPr>
+          <w:b/>
+          <w:bCs/>
+        </w:rPr>
+        <w:t>npm</w:t>
+      </w:r>
+      <w:proofErr w:type="spellEnd"/>
+      <w:r>
+        <w:rPr>
+          <w:b/>
+          <w:bCs/>
+        </w:rPr>
         <w:t xml:space="preserve"> </w:t>
       </w:r>
       <w:proofErr w:type="spellStart"/>
       <w:r>
-        <w:t>migrate</w:t>
+        <w:rPr>
+          <w:b/>
+          <w:bCs/>
+        </w:rPr>
+        <w:t>install</w:t>
       </w:r>
       <w:proofErr w:type="spellEnd"/>
-    </w:p>
-    <w:p>
-      <w:pPr>
-        <w:rPr>
-          <w:b/>
-          <w:bCs/>
-        </w:rPr>
-      </w:pPr>
-      <w:r>
-        <w:rPr>
-          <w:b/>
-          <w:bCs/>
-        </w:rPr>
-        <w:t>5</w:t>
-      </w:r>
-      <w:r>
-        <w:rPr>
-          <w:b/>
-          <w:bCs/>
-        </w:rPr>
-        <w:t>. Projekt indítása:</w:t>
-      </w:r>
-    </w:p>
-    <w:p>
-      <w:pPr>
-        <w:ind w:left="708"/>
-      </w:pPr>
-      <w:r>
-        <w:t xml:space="preserve">php </w:t>
+      <w:r>
+        <w:rPr>
+          <w:b/>
+          <w:bCs/>
+        </w:rPr>
+        <w:t xml:space="preserve"> </w:t>
       </w:r>
       <w:proofErr w:type="spellStart"/>
       <w:r>
-        <w:t>artisan</w:t>
+        <w:rPr>
+          <w:b/>
+          <w:bCs/>
+        </w:rPr>
+        <w:t>bootstrap-icons</w:t>
       </w:r>
       <w:proofErr w:type="spellEnd"/>
-      <w:r>
+    </w:p>
+    <w:p>
+      <w:pPr>
+        <w:pStyle w:val="Listaszerbekezds"/>
+        <w:numPr>
+          <w:ilvl w:val="1"/>
+          <w:numId w:val="31"/>
+        </w:numPr>
+        <w:rPr>
+          <w:b/>
+          <w:bCs/>
+        </w:rPr>
+      </w:pPr>
+      <w:proofErr w:type="spellStart"/>
+      <w:r>
+        <w:rPr>
+          <w:b/>
+          <w:bCs/>
+        </w:rPr>
+        <w:t>npm</w:t>
+      </w:r>
+      <w:proofErr w:type="spellEnd"/>
+      <w:r>
+        <w:rPr>
+          <w:b/>
+          <w:bCs/>
+        </w:rPr>
         <w:t xml:space="preserve"> </w:t>
       </w:r>
       <w:proofErr w:type="spellStart"/>
       <w:r>
-        <w:t>serve</w:t>
+        <w:rPr>
+          <w:b/>
+          <w:bCs/>
+        </w:rPr>
+        <w:t>install</w:t>
       </w:r>
       <w:proofErr w:type="spellEnd"/>
       <w:r>
+        <w:rPr>
+          <w:b/>
+          <w:bCs/>
+        </w:rPr>
         <w:t xml:space="preserve"> </w:t>
       </w:r>
-    </w:p>
-    <w:p>
-      <w:pPr>
-        <w:rPr>
-          <w:b/>
-          <w:bCs/>
-          <w:sz w:val="32"/>
-          <w:szCs w:val="32"/>
-          <w:u w:val="single"/>
-        </w:rPr>
-      </w:pPr>
-    </w:p>
-    <w:p>
-      <w:pPr>
-        <w:rPr>
-          <w:b/>
-          <w:bCs/>
-          <w:sz w:val="32"/>
-          <w:szCs w:val="32"/>
-          <w:u w:val="single"/>
-        </w:rPr>
-      </w:pPr>
       <w:proofErr w:type="spellStart"/>
       <w:r>
         <w:rPr>
           <w:b/>
           <w:bCs/>
-          <w:sz w:val="32"/>
-          <w:szCs w:val="32"/>
-          <w:u w:val="single"/>
-        </w:rPr>
-        <w:t>React</w:t>
-      </w:r>
-      <w:r>
-        <w:rPr>
-          <w:b/>
-          <w:bCs/>
-          <w:sz w:val="32"/>
-          <w:szCs w:val="32"/>
-          <w:u w:val="single"/>
-        </w:rPr>
-        <w:t>ben</w:t>
+        </w:rPr>
+        <w:t>react</w:t>
       </w:r>
       <w:proofErr w:type="spellEnd"/>
       <w:r>
         <w:rPr>
           <w:b/>
           <w:bCs/>
-          <w:sz w:val="32"/>
-          <w:szCs w:val="32"/>
-          <w:u w:val="single"/>
-        </w:rPr>
-        <w:t>:</w:t>
-      </w:r>
-    </w:p>
-    <w:p>
-      <w:pPr>
-        <w:rPr>
-          <w:b/>
-          <w:bCs/>
-        </w:rPr>
-      </w:pPr>
-      <w:r>
-        <w:rPr>
-          <w:b/>
-          <w:bCs/>
-        </w:rPr>
-        <w:t>1. Projekt megnyitása:</w:t>
-      </w:r>
-    </w:p>
-    <w:p>
-      <w:pPr>
-        <w:ind w:firstLine="708"/>
-      </w:pPr>
-      <w:r>
-        <w:lastRenderedPageBreak/>
-        <w:t xml:space="preserve">cd </w:t>
+        </w:rPr>
+        <w:t>-router-</w:t>
       </w:r>
       <w:proofErr w:type="spellStart"/>
       <w:r>
-        <w:t>bbs</w:t>
-      </w:r>
-      <w:r>
-        <w:t>frontend</w:t>
+        <w:rPr>
+          <w:b/>
+          <w:bCs/>
+        </w:rPr>
+        <w:t>dom</w:t>
       </w:r>
       <w:proofErr w:type="spellEnd"/>
     </w:p>
     <w:p>
       <w:pPr>
-        <w:rPr>
-          <w:b/>
-          <w:bCs/>
-        </w:rPr>
-      </w:pPr>
-      <w:r>
-        <w:rPr>
-          <w:b/>
-          <w:bCs/>
-        </w:rPr>
-        <w:t xml:space="preserve">2. </w:t>
-      </w:r>
+        <w:pStyle w:val="Listaszerbekezds"/>
+        <w:numPr>
+          <w:ilvl w:val="1"/>
+          <w:numId w:val="31"/>
+        </w:numPr>
+      </w:pPr>
       <w:proofErr w:type="spellStart"/>
       <w:r>
         <w:rPr>
           <w:b/>
           <w:bCs/>
         </w:rPr>
-        <w:t>Package</w:t>
+        <w:t>npm</w:t>
       </w:r>
       <w:proofErr w:type="spellEnd"/>
       <w:r>
@@ -2183,28 +2634,65 @@
           <w:b/>
           <w:bCs/>
         </w:rPr>
-        <w:t>-ek telepítése:</w:t>
-      </w:r>
-    </w:p>
-    <w:p>
-      <w:pPr>
-        <w:ind w:firstLine="708"/>
-        <w:rPr>
-          <w:b/>
-          <w:bCs/>
-        </w:rPr>
-      </w:pPr>
+        <w:t xml:space="preserve"> </w:t>
+      </w:r>
       <w:proofErr w:type="spellStart"/>
       <w:r>
+        <w:rPr>
+          <w:b/>
+          <w:bCs/>
+        </w:rPr>
+        <w:t>install</w:t>
+      </w:r>
+      <w:proofErr w:type="spellEnd"/>
+      <w:r>
+        <w:rPr>
+          <w:b/>
+          <w:bCs/>
+        </w:rPr>
+        <w:t xml:space="preserve"> </w:t>
+      </w:r>
+      <w:proofErr w:type="spellStart"/>
+      <w:r>
+        <w:rPr>
+          <w:b/>
+          <w:bCs/>
+        </w:rPr>
+        <w:t>recharts</w:t>
+      </w:r>
+      <w:proofErr w:type="spellEnd"/>
+    </w:p>
+    <w:p>
+      <w:pPr>
+        <w:pStyle w:val="Listaszerbekezds"/>
+        <w:numPr>
+          <w:ilvl w:val="1"/>
+          <w:numId w:val="31"/>
+        </w:numPr>
+      </w:pPr>
+      <w:proofErr w:type="spellStart"/>
+      <w:r>
+        <w:rPr>
+          <w:b/>
+          <w:bCs/>
+        </w:rPr>
         <w:t>npm</w:t>
       </w:r>
       <w:proofErr w:type="spellEnd"/>
       <w:r>
+        <w:rPr>
+          <w:b/>
+          <w:bCs/>
+        </w:rPr>
         <w:t xml:space="preserve"> </w:t>
       </w:r>
       <w:proofErr w:type="spellStart"/>
       <w:r>
-        <w:t>install</w:t>
+        <w:rPr>
+          <w:b/>
+          <w:bCs/>
+        </w:rPr>
+        <w:t>run</w:t>
       </w:r>
       <w:proofErr w:type="spellEnd"/>
       <w:r>
@@ -2214,293 +2702,82 @@
         </w:rPr>
         <w:t xml:space="preserve"> </w:t>
       </w:r>
-    </w:p>
-    <w:p>
-      <w:pPr>
-        <w:ind w:firstLine="708"/>
-      </w:pPr>
       <w:proofErr w:type="spellStart"/>
       <w:r>
-        <w:t>npm</w:t>
+        <w:rPr>
+          <w:b/>
+          <w:bCs/>
+        </w:rPr>
+        <w:t>dev</w:t>
       </w:r>
       <w:proofErr w:type="spellEnd"/>
+    </w:p>
+    <w:p>
+      <w:r>
+        <w:t>A projektet a következő linkekkel lehet elérni:</w:t>
+      </w:r>
       <w:r>
         <w:t xml:space="preserve"> </w:t>
       </w:r>
+    </w:p>
+    <w:p>
+      <w:r>
+        <w:tab/>
+      </w:r>
       <w:proofErr w:type="spellStart"/>
       <w:r>
-        <w:t>install</w:t>
+        <w:t>User</w:t>
       </w:r>
       <w:proofErr w:type="spellEnd"/>
       <w:r>
+        <w:t xml:space="preserve"> felület: </w:t>
+      </w:r>
+      <w:hyperlink r:id="rId14" w:history="1">
+        <w:r>
+          <w:rPr>
+            <w:rStyle w:val="Hiperhivatkozs"/>
+          </w:rPr>
+          <w:t>http://localhost:5173</w:t>
+        </w:r>
+        <w:r>
+          <w:rPr>
+            <w:rStyle w:val="Hiperhivatkozs"/>
+          </w:rPr>
+          <w:t>/</w:t>
+        </w:r>
+        <w:r>
+          <w:rPr>
+            <w:rStyle w:val="Hiperhivatkozs"/>
+          </w:rPr>
+          <w:t>login</w:t>
+        </w:r>
+      </w:hyperlink>
+      <w:r>
+        <w:br/>
+      </w:r>
+      <w:r>
+        <w:tab/>
+      </w:r>
+      <w:proofErr w:type="spellStart"/>
+      <w:r>
+        <w:t>Admin</w:t>
+      </w:r>
+      <w:proofErr w:type="spellEnd"/>
+      <w:r>
+        <w:t xml:space="preserve"> felület:</w:t>
+      </w:r>
+      <w:r>
         <w:t xml:space="preserve"> </w:t>
       </w:r>
-      <w:proofErr w:type="spellStart"/>
-      <w:r>
-        <w:t>axios</w:t>
-      </w:r>
-      <w:proofErr w:type="spellEnd"/>
-    </w:p>
-    <w:p>
-      <w:pPr>
-        <w:ind w:firstLine="708"/>
-      </w:pPr>
-      <w:proofErr w:type="spellStart"/>
-      <w:r>
-        <w:t>npm</w:t>
-      </w:r>
-      <w:proofErr w:type="spellEnd"/>
-      <w:r>
-        <w:t xml:space="preserve"> </w:t>
-      </w:r>
-      <w:proofErr w:type="spellStart"/>
-      <w:r>
-        <w:t>install</w:t>
-      </w:r>
-      <w:proofErr w:type="spellEnd"/>
-      <w:r>
-        <w:t xml:space="preserve"> </w:t>
-      </w:r>
-      <w:proofErr w:type="spellStart"/>
-      <w:r>
-        <w:t>bootstrap</w:t>
-      </w:r>
-      <w:proofErr w:type="spellEnd"/>
-      <w:r>
-        <w:t xml:space="preserve"> </w:t>
-      </w:r>
-      <w:proofErr w:type="spellStart"/>
-      <w:r>
-        <w:t>react-bootstrap</w:t>
-      </w:r>
-      <w:proofErr w:type="spellEnd"/>
-    </w:p>
-    <w:p>
-      <w:pPr>
-        <w:ind w:firstLine="708"/>
-      </w:pPr>
-      <w:proofErr w:type="spellStart"/>
-      <w:r>
-        <w:t>npm</w:t>
-      </w:r>
-      <w:proofErr w:type="spellEnd"/>
-      <w:r>
-        <w:t xml:space="preserve"> </w:t>
-      </w:r>
-      <w:proofErr w:type="spellStart"/>
-      <w:r>
-        <w:t>install</w:t>
-      </w:r>
-      <w:proofErr w:type="spellEnd"/>
-      <w:r>
-        <w:t xml:space="preserve"> </w:t>
-      </w:r>
-      <w:proofErr w:type="spellStart"/>
-      <w:r>
-        <w:t>bootstrap</w:t>
-      </w:r>
-      <w:r>
-        <w:t>-icons</w:t>
-      </w:r>
-      <w:proofErr w:type="spellEnd"/>
-    </w:p>
-    <w:p>
-      <w:pPr>
-        <w:ind w:firstLine="708"/>
-      </w:pPr>
-      <w:proofErr w:type="spellStart"/>
-      <w:r>
-        <w:t>npm</w:t>
-      </w:r>
-      <w:proofErr w:type="spellEnd"/>
-      <w:r>
-        <w:t xml:space="preserve"> </w:t>
-      </w:r>
-      <w:proofErr w:type="spellStart"/>
-      <w:r>
-        <w:t>install</w:t>
-      </w:r>
-      <w:proofErr w:type="spellEnd"/>
-      <w:r>
-        <w:t xml:space="preserve"> </w:t>
-      </w:r>
-      <w:proofErr w:type="spellStart"/>
-      <w:r>
-        <w:t>react</w:t>
-      </w:r>
-      <w:proofErr w:type="spellEnd"/>
-      <w:r>
-        <w:t>-router-</w:t>
-      </w:r>
-      <w:proofErr w:type="spellStart"/>
-      <w:r>
-        <w:t>dom</w:t>
-      </w:r>
-      <w:proofErr w:type="spellEnd"/>
-    </w:p>
-    <w:p>
-      <w:pPr>
-        <w:ind w:firstLine="708"/>
-      </w:pPr>
-      <w:proofErr w:type="spellStart"/>
-      <w:r>
-        <w:t>npm</w:t>
-      </w:r>
-      <w:proofErr w:type="spellEnd"/>
-      <w:r>
-        <w:t xml:space="preserve"> </w:t>
-      </w:r>
-      <w:proofErr w:type="spellStart"/>
-      <w:r>
-        <w:t>install</w:t>
-      </w:r>
-      <w:proofErr w:type="spellEnd"/>
-      <w:r>
-        <w:t xml:space="preserve"> </w:t>
-      </w:r>
-      <w:proofErr w:type="spellStart"/>
-      <w:r>
-        <w:t>recharts</w:t>
-      </w:r>
-      <w:proofErr w:type="spellEnd"/>
-    </w:p>
-    <w:p>
-      <w:pPr>
-        <w:rPr>
-          <w:b/>
-          <w:bCs/>
-        </w:rPr>
-      </w:pPr>
-      <w:r>
-        <w:rPr>
-          <w:b/>
-          <w:bCs/>
-        </w:rPr>
-        <w:t>5</w:t>
-      </w:r>
-      <w:r>
-        <w:rPr>
-          <w:b/>
-          <w:bCs/>
-        </w:rPr>
-        <w:t>. Projekt indítása:</w:t>
-      </w:r>
-    </w:p>
-    <w:p>
-      <w:pPr>
-        <w:ind w:left="708"/>
-      </w:pPr>
-      <w:proofErr w:type="spellStart"/>
-      <w:r>
-        <w:t>npm</w:t>
-      </w:r>
-      <w:proofErr w:type="spellEnd"/>
-      <w:r>
-        <w:t xml:space="preserve"> </w:t>
-      </w:r>
-      <w:proofErr w:type="spellStart"/>
-      <w:r>
-        <w:t>run</w:t>
-      </w:r>
-      <w:proofErr w:type="spellEnd"/>
-      <w:r>
-        <w:t xml:space="preserve"> </w:t>
-      </w:r>
-      <w:proofErr w:type="spellStart"/>
-      <w:r>
-        <w:t>dev</w:t>
-      </w:r>
-      <w:proofErr w:type="spellEnd"/>
-    </w:p>
-    <w:p>
-      <w:r>
-        <w:rPr>
-          <w:b/>
-          <w:bCs/>
-        </w:rPr>
-        <w:t>6</w:t>
-      </w:r>
-      <w:r>
-        <w:rPr>
-          <w:b/>
-          <w:bCs/>
-        </w:rPr>
-        <w:t xml:space="preserve">. </w:t>
-      </w:r>
-      <w:r>
-        <w:rPr>
-          <w:b/>
-          <w:bCs/>
-        </w:rPr>
-        <w:t>Böngészőben</w:t>
-      </w:r>
-      <w:r>
-        <w:rPr>
-          <w:b/>
-          <w:bCs/>
-        </w:rPr>
-        <w:t>:</w:t>
-      </w:r>
-      <w:r>
-        <w:t xml:space="preserve"> </w:t>
-      </w:r>
-    </w:p>
-    <w:p>
-      <w:r>
-        <w:tab/>
-      </w:r>
-      <w:proofErr w:type="spellStart"/>
-      <w:r>
-        <w:t>Admin</w:t>
-      </w:r>
-      <w:proofErr w:type="spellEnd"/>
-      <w:r>
-        <w:t xml:space="preserve"> felület:</w:t>
-      </w:r>
-      <w:r>
-        <w:t xml:space="preserve"> </w:t>
-      </w:r>
-      <w:r>
-        <w:t>http://localhost:5173</w:t>
-      </w:r>
-      <w:r>
-        <w:t>/admin/login</w:t>
-      </w:r>
-    </w:p>
-    <w:p>
-      <w:r>
-        <w:tab/>
-      </w:r>
-      <w:proofErr w:type="spellStart"/>
-      <w:r>
-        <w:t>User</w:t>
-      </w:r>
-      <w:proofErr w:type="spellEnd"/>
-      <w:r>
-        <w:t xml:space="preserve"> felület:</w:t>
-      </w:r>
-      <w:r>
-        <w:t xml:space="preserve"> </w:t>
-      </w:r>
-      <w:r>
-        <w:t>http://localhost:5173</w:t>
-      </w:r>
-      <w:r>
-        <w:t>/user/login</w:t>
-      </w:r>
-    </w:p>
-    <w:p>
-      <w:pPr>
-        <w:rPr>
-          <w:b/>
-          <w:bCs/>
-          <w:sz w:val="32"/>
-          <w:szCs w:val="32"/>
-          <w:u w:val="single"/>
-        </w:rPr>
-      </w:pPr>
-    </w:p>
-    <w:p/>
+      <w:hyperlink r:id="rId15" w:history="1">
+        <w:r>
+          <w:rPr>
+            <w:rStyle w:val="Hiperhivatkozs"/>
+          </w:rPr>
+          <w:t>http://localhost:5173/admin/login</w:t>
+        </w:r>
+      </w:hyperlink>
+    </w:p>
     <w:sectPr>
       <w:pgSz w:w="11906" w:h="16838"/>
       <w:pgMar w:top="720" w:right="720" w:bottom="720" w:left="720" w:header="708" w:footer="708" w:gutter="0"/>
@@ -2512,7 +2789,7 @@
 </file>
 
 <file path=word/numbering.xml><?xml version="1.0" encoding="utf-8"?>
-<w:numbering xmlns:wpc="http://schemas.microsoft.com/office/word/2010/wordprocessingCanvas" xmlns:cx="http://schemas.microsoft.com/office/drawing/2014/chartex" xmlns:cx1="http://schemas.microsoft.com/office/drawing/2015/9/8/chartex" xmlns:cx2="http://schemas.microsoft.com/office/drawing/2015/10/21/chartex" xmlns:cx3="http://schemas.microsoft.com/office/drawing/2016/5/9/chartex" xmlns:cx4="http://schemas.microsoft.com/office/drawing/2016/5/10/chartex" xmlns:cx5="http://schemas.microsoft.com/office/drawing/2016/5/11/chartex" xmlns:cx6="http://schemas.microsoft.com/office/drawing/2016/5/12/chartex" xmlns:cx7="http://schemas.microsoft.com/office/drawing/2016/5/13/chartex" xmlns:cx8="http://schemas.microsoft.com/office/drawing/2016/5/14/chartex" xmlns:mc="http://schemas.openxmlformats.org/markup-compatibility/2006" xmlns:aink="http://schemas.microsoft.com/office/drawing/2016/ink" xmlns:am3d="http://schemas.microsoft.com/office/drawing/2017/model3d" xmlns:o="urn:schemas-microsoft-com:office:office" xmlns:r="http://schemas.openxmlformats.org/officeDocument/2006/relationships" xmlns:m="http://schemas.openxmlformats.org/officeDocument/2006/math" xmlns:v="urn:schemas-microsoft-com:vml" xmlns:wp14="http://schemas.microsoft.com/office/word/2010/wordprocessingDrawing" xmlns:wp="http://schemas.openxmlformats.org/drawingml/2006/wordprocessingDrawing" xmlns:w10="urn:schemas-microsoft-com:office:word" xmlns:w="http://schemas.openxmlformats.org/wordprocessingml/2006/main" xmlns:w14="http://schemas.microsoft.com/office/word/2010/wordml" xmlns:w15="http://schemas.microsoft.com/office/word/2012/wordml" xmlns:w16cex="http://schemas.microsoft.com/office/word/2018/wordml/cex" xmlns:w16cid="http://schemas.microsoft.com/office/word/2016/wordml/cid" xmlns:w16="http://schemas.microsoft.com/office/word/2018/wordml" xmlns:w16sdtdh="http://schemas.microsoft.com/office/word/2020/wordml/sdtdatahash" xmlns:w16se="http://schemas.microsoft.com/office/word/2015/wordml/symex" xmlns:wpg="http://schemas.microsoft.com/office/word/2010/wordprocessingGroup" xmlns:wpi="http://schemas.microsoft.com/office/word/2010/wordprocessingInk" xmlns:wne="http://schemas.microsoft.com/office/word/2006/wordml" xmlns:wps="http://schemas.microsoft.com/office/word/2010/wordprocessingShape" mc:Ignorable="w14 w15 w16se w16cid w16 w16cex w16sdtdh wp14">
+<w:numbering xmlns:wpc="http://schemas.microsoft.com/office/word/2010/wordprocessingCanvas" xmlns:cx="http://schemas.microsoft.com/office/drawing/2014/chartex" xmlns:cx1="http://schemas.microsoft.com/office/drawing/2015/9/8/chartex" xmlns:cx2="http://schemas.microsoft.com/office/drawing/2015/10/21/chartex" xmlns:cx3="http://schemas.microsoft.com/office/drawing/2016/5/9/chartex" xmlns:cx4="http://schemas.microsoft.com/office/drawing/2016/5/10/chartex" xmlns:cx5="http://schemas.microsoft.com/office/drawing/2016/5/11/chartex" xmlns:cx6="http://schemas.microsoft.com/office/drawing/2016/5/12/chartex" xmlns:cx7="http://schemas.microsoft.com/office/drawing/2016/5/13/chartex" xmlns:cx8="http://schemas.microsoft.com/office/drawing/2016/5/14/chartex" xmlns:mc="http://schemas.openxmlformats.org/markup-compatibility/2006" xmlns:aink="http://schemas.microsoft.com/office/drawing/2016/ink" xmlns:am3d="http://schemas.microsoft.com/office/drawing/2017/model3d" xmlns:o="urn:schemas-microsoft-com:office:office" xmlns:oel="http://schemas.microsoft.com/office/2019/extlst" xmlns:r="http://schemas.openxmlformats.org/officeDocument/2006/relationships" xmlns:m="http://schemas.openxmlformats.org/officeDocument/2006/math" xmlns:v="urn:schemas-microsoft-com:vml" xmlns:wp14="http://schemas.microsoft.com/office/word/2010/wordprocessingDrawing" xmlns:wp="http://schemas.openxmlformats.org/drawingml/2006/wordprocessingDrawing" xmlns:w10="urn:schemas-microsoft-com:office:word" xmlns:w="http://schemas.openxmlformats.org/wordprocessingml/2006/main" xmlns:w14="http://schemas.microsoft.com/office/word/2010/wordml" xmlns:w15="http://schemas.microsoft.com/office/word/2012/wordml" xmlns:w16cex="http://schemas.microsoft.com/office/word/2018/wordml/cex" xmlns:w16cid="http://schemas.microsoft.com/office/word/2016/wordml/cid" xmlns:w16="http://schemas.microsoft.com/office/word/2018/wordml" xmlns:w16du="http://schemas.microsoft.com/office/word/2023/wordml/word16du" xmlns:w16sdtdh="http://schemas.microsoft.com/office/word/2020/wordml/sdtdatahash" xmlns:w16sdtfl="http://schemas.microsoft.com/office/word/2024/wordml/sdtformatlock" xmlns:w16se="http://schemas.microsoft.com/office/word/2015/wordml/symex" xmlns:wpg="http://schemas.microsoft.com/office/word/2010/wordprocessingGroup" xmlns:wpi="http://schemas.microsoft.com/office/word/2010/wordprocessingInk" xmlns:wne="http://schemas.microsoft.com/office/word/2006/wordml" xmlns:wps="http://schemas.microsoft.com/office/word/2010/wordprocessingShape" mc:Ignorable="w14 w15 w16se w16cid w16 w16cex w16sdtdh w16sdtfl w16du wp14">
   <w:abstractNum w:abstractNumId="0" w15:restartNumberingAfterBreak="0">
     <w:nsid w:val="0C357CDE"/>
     <w:multiLevelType w:val="multilevel"/>
@@ -3670,6 +3947,118 @@
     </w:lvl>
   </w:abstractNum>
   <w:abstractNum w:abstractNumId="8" w15:restartNumberingAfterBreak="0">
+    <w:nsid w:val="27714622"/>
+    <w:multiLevelType w:val="hybridMultilevel"/>
+    <w:tmpl w:val="6F8E31DA"/>
+    <w:lvl w:ilvl="0" w:tplc="EC4A6A06">
+      <w:numFmt w:val="bullet"/>
+      <w:lvlText w:val="-"/>
+      <w:lvlJc w:val="left"/>
+      <w:pPr>
+        <w:ind w:left="360" w:hanging="360"/>
+      </w:pPr>
+      <w:rPr>
+        <w:rFonts w:ascii="Cambria" w:eastAsiaTheme="minorEastAsia" w:hAnsi="Cambria" w:cstheme="minorBidi" w:hint="default"/>
+      </w:rPr>
+    </w:lvl>
+    <w:lvl w:ilvl="1" w:tplc="040E0003">
+      <w:start w:val="1"/>
+      <w:numFmt w:val="bullet"/>
+      <w:lvlText w:val="o"/>
+      <w:lvlJc w:val="left"/>
+      <w:pPr>
+        <w:ind w:left="1080" w:hanging="360"/>
+      </w:pPr>
+      <w:rPr>
+        <w:rFonts w:ascii="Courier New" w:hAnsi="Courier New" w:cs="Courier New" w:hint="default"/>
+      </w:rPr>
+    </w:lvl>
+    <w:lvl w:ilvl="2" w:tplc="040E0005">
+      <w:start w:val="1"/>
+      <w:numFmt w:val="bullet"/>
+      <w:lvlText w:val=""/>
+      <w:lvlJc w:val="left"/>
+      <w:pPr>
+        <w:ind w:left="1800" w:hanging="360"/>
+      </w:pPr>
+      <w:rPr>
+        <w:rFonts w:ascii="Wingdings" w:hAnsi="Wingdings" w:hint="default"/>
+      </w:rPr>
+    </w:lvl>
+    <w:lvl w:ilvl="3" w:tplc="040E0001" w:tentative="1">
+      <w:start w:val="1"/>
+      <w:numFmt w:val="bullet"/>
+      <w:lvlText w:val=""/>
+      <w:lvlJc w:val="left"/>
+      <w:pPr>
+        <w:ind w:left="2520" w:hanging="360"/>
+      </w:pPr>
+      <w:rPr>
+        <w:rFonts w:ascii="Symbol" w:hAnsi="Symbol" w:hint="default"/>
+      </w:rPr>
+    </w:lvl>
+    <w:lvl w:ilvl="4" w:tplc="040E0003" w:tentative="1">
+      <w:start w:val="1"/>
+      <w:numFmt w:val="bullet"/>
+      <w:lvlText w:val="o"/>
+      <w:lvlJc w:val="left"/>
+      <w:pPr>
+        <w:ind w:left="3240" w:hanging="360"/>
+      </w:pPr>
+      <w:rPr>
+        <w:rFonts w:ascii="Courier New" w:hAnsi="Courier New" w:cs="Courier New" w:hint="default"/>
+      </w:rPr>
+    </w:lvl>
+    <w:lvl w:ilvl="5" w:tplc="040E0005" w:tentative="1">
+      <w:start w:val="1"/>
+      <w:numFmt w:val="bullet"/>
+      <w:lvlText w:val=""/>
+      <w:lvlJc w:val="left"/>
+      <w:pPr>
+        <w:ind w:left="3960" w:hanging="360"/>
+      </w:pPr>
+      <w:rPr>
+        <w:rFonts w:ascii="Wingdings" w:hAnsi="Wingdings" w:hint="default"/>
+      </w:rPr>
+    </w:lvl>
+    <w:lvl w:ilvl="6" w:tplc="040E0001" w:tentative="1">
+      <w:start w:val="1"/>
+      <w:numFmt w:val="bullet"/>
+      <w:lvlText w:val=""/>
+      <w:lvlJc w:val="left"/>
+      <w:pPr>
+        <w:ind w:left="4680" w:hanging="360"/>
+      </w:pPr>
+      <w:rPr>
+        <w:rFonts w:ascii="Symbol" w:hAnsi="Symbol" w:hint="default"/>
+      </w:rPr>
+    </w:lvl>
+    <w:lvl w:ilvl="7" w:tplc="040E0003" w:tentative="1">
+      <w:start w:val="1"/>
+      <w:numFmt w:val="bullet"/>
+      <w:lvlText w:val="o"/>
+      <w:lvlJc w:val="left"/>
+      <w:pPr>
+        <w:ind w:left="5400" w:hanging="360"/>
+      </w:pPr>
+      <w:rPr>
+        <w:rFonts w:ascii="Courier New" w:hAnsi="Courier New" w:cs="Courier New" w:hint="default"/>
+      </w:rPr>
+    </w:lvl>
+    <w:lvl w:ilvl="8" w:tplc="040E0005" w:tentative="1">
+      <w:start w:val="1"/>
+      <w:numFmt w:val="bullet"/>
+      <w:lvlText w:val=""/>
+      <w:lvlJc w:val="left"/>
+      <w:pPr>
+        <w:ind w:left="6120" w:hanging="360"/>
+      </w:pPr>
+      <w:rPr>
+        <w:rFonts w:ascii="Wingdings" w:hAnsi="Wingdings" w:hint="default"/>
+      </w:rPr>
+    </w:lvl>
+  </w:abstractNum>
+  <w:abstractNum w:abstractNumId="9" w15:restartNumberingAfterBreak="0">
     <w:nsid w:val="2AE129FA"/>
     <w:multiLevelType w:val="multilevel"/>
     <w:tmpl w:val="257C6720"/>
@@ -3818,7 +4207,7 @@
       </w:rPr>
     </w:lvl>
   </w:abstractNum>
-  <w:abstractNum w:abstractNumId="9" w15:restartNumberingAfterBreak="0">
+  <w:abstractNum w:abstractNumId="10" w15:restartNumberingAfterBreak="0">
     <w:nsid w:val="2ED734A3"/>
     <w:multiLevelType w:val="hybridMultilevel"/>
     <w:tmpl w:val="EF0092D4"/>
@@ -3931,7 +4320,7 @@
       </w:rPr>
     </w:lvl>
   </w:abstractNum>
-  <w:abstractNum w:abstractNumId="10" w15:restartNumberingAfterBreak="0">
+  <w:abstractNum w:abstractNumId="11" w15:restartNumberingAfterBreak="0">
     <w:nsid w:val="30E74191"/>
     <w:multiLevelType w:val="hybridMultilevel"/>
     <w:tmpl w:val="58644BC8"/>
@@ -4044,7 +4433,7 @@
       </w:rPr>
     </w:lvl>
   </w:abstractNum>
-  <w:abstractNum w:abstractNumId="11" w15:restartNumberingAfterBreak="0">
+  <w:abstractNum w:abstractNumId="12" w15:restartNumberingAfterBreak="0">
     <w:nsid w:val="33725147"/>
     <w:multiLevelType w:val="hybridMultilevel"/>
     <w:tmpl w:val="9F94697E"/>
@@ -4157,7 +4546,7 @@
       </w:rPr>
     </w:lvl>
   </w:abstractNum>
-  <w:abstractNum w:abstractNumId="12" w15:restartNumberingAfterBreak="0">
+  <w:abstractNum w:abstractNumId="13" w15:restartNumberingAfterBreak="0">
     <w:nsid w:val="3DAA6BEE"/>
     <w:multiLevelType w:val="multilevel"/>
     <w:tmpl w:val="BF769E06"/>
@@ -4306,7 +4695,7 @@
       </w:rPr>
     </w:lvl>
   </w:abstractNum>
-  <w:abstractNum w:abstractNumId="13" w15:restartNumberingAfterBreak="0">
+  <w:abstractNum w:abstractNumId="14" w15:restartNumberingAfterBreak="0">
     <w:nsid w:val="3FDD392E"/>
     <w:multiLevelType w:val="multilevel"/>
     <w:tmpl w:val="C8A29604"/>
@@ -4455,7 +4844,97 @@
       </w:rPr>
     </w:lvl>
   </w:abstractNum>
-  <w:abstractNum w:abstractNumId="14" w15:restartNumberingAfterBreak="0">
+  <w:abstractNum w:abstractNumId="15" w15:restartNumberingAfterBreak="0">
+    <w:nsid w:val="409D789D"/>
+    <w:multiLevelType w:val="hybridMultilevel"/>
+    <w:tmpl w:val="DE3C598E"/>
+    <w:lvl w:ilvl="0" w:tplc="FFFFFFFF">
+      <w:numFmt w:val="bullet"/>
+      <w:lvlText w:val="-"/>
+      <w:lvlJc w:val="left"/>
+      <w:pPr>
+        <w:ind w:left="360" w:hanging="360"/>
+      </w:pPr>
+      <w:rPr>
+        <w:rFonts w:ascii="Cambria" w:eastAsiaTheme="minorEastAsia" w:hAnsi="Cambria" w:cstheme="minorBidi" w:hint="default"/>
+      </w:rPr>
+    </w:lvl>
+    <w:lvl w:ilvl="1" w:tplc="5CC20546">
+      <w:numFmt w:val="bullet"/>
+      <w:lvlText w:val="&gt;"/>
+      <w:lvlJc w:val="left"/>
+      <w:pPr>
+        <w:ind w:left="1080" w:hanging="360"/>
+      </w:pPr>
+      <w:rPr>
+        <w:rFonts w:ascii="Cambria" w:eastAsiaTheme="minorEastAsia" w:hAnsi="Cambria" w:cstheme="minorBidi" w:hint="default"/>
+      </w:rPr>
+    </w:lvl>
+    <w:lvl w:ilvl="2" w:tplc="FFFFFFFF" w:tentative="1">
+      <w:start w:val="1"/>
+      <w:numFmt w:val="lowerRoman"/>
+      <w:lvlText w:val="%3."/>
+      <w:lvlJc w:val="right"/>
+      <w:pPr>
+        <w:ind w:left="1800" w:hanging="180"/>
+      </w:pPr>
+    </w:lvl>
+    <w:lvl w:ilvl="3" w:tplc="FFFFFFFF" w:tentative="1">
+      <w:start w:val="1"/>
+      <w:numFmt w:val="decimal"/>
+      <w:lvlText w:val="%4."/>
+      <w:lvlJc w:val="left"/>
+      <w:pPr>
+        <w:ind w:left="2520" w:hanging="360"/>
+      </w:pPr>
+    </w:lvl>
+    <w:lvl w:ilvl="4" w:tplc="FFFFFFFF" w:tentative="1">
+      <w:start w:val="1"/>
+      <w:numFmt w:val="lowerLetter"/>
+      <w:lvlText w:val="%5."/>
+      <w:lvlJc w:val="left"/>
+      <w:pPr>
+        <w:ind w:left="3240" w:hanging="360"/>
+      </w:pPr>
+    </w:lvl>
+    <w:lvl w:ilvl="5" w:tplc="FFFFFFFF" w:tentative="1">
+      <w:start w:val="1"/>
+      <w:numFmt w:val="lowerRoman"/>
+      <w:lvlText w:val="%6."/>
+      <w:lvlJc w:val="right"/>
+      <w:pPr>
+        <w:ind w:left="3960" w:hanging="180"/>
+      </w:pPr>
+    </w:lvl>
+    <w:lvl w:ilvl="6" w:tplc="FFFFFFFF" w:tentative="1">
+      <w:start w:val="1"/>
+      <w:numFmt w:val="decimal"/>
+      <w:lvlText w:val="%7."/>
+      <w:lvlJc w:val="left"/>
+      <w:pPr>
+        <w:ind w:left="4680" w:hanging="360"/>
+      </w:pPr>
+    </w:lvl>
+    <w:lvl w:ilvl="7" w:tplc="FFFFFFFF" w:tentative="1">
+      <w:start w:val="1"/>
+      <w:numFmt w:val="lowerLetter"/>
+      <w:lvlText w:val="%8."/>
+      <w:lvlJc w:val="left"/>
+      <w:pPr>
+        <w:ind w:left="5400" w:hanging="360"/>
+      </w:pPr>
+    </w:lvl>
+    <w:lvl w:ilvl="8" w:tplc="FFFFFFFF" w:tentative="1">
+      <w:start w:val="1"/>
+      <w:numFmt w:val="lowerRoman"/>
+      <w:lvlText w:val="%9."/>
+      <w:lvlJc w:val="right"/>
+      <w:pPr>
+        <w:ind w:left="6120" w:hanging="180"/>
+      </w:pPr>
+    </w:lvl>
+  </w:abstractNum>
+  <w:abstractNum w:abstractNumId="16" w15:restartNumberingAfterBreak="0">
     <w:nsid w:val="490F1432"/>
     <w:multiLevelType w:val="hybridMultilevel"/>
     <w:tmpl w:val="016A860A"/>
@@ -4568,7 +5047,7 @@
       </w:rPr>
     </w:lvl>
   </w:abstractNum>
-  <w:abstractNum w:abstractNumId="15" w15:restartNumberingAfterBreak="0">
+  <w:abstractNum w:abstractNumId="17" w15:restartNumberingAfterBreak="0">
     <w:nsid w:val="4A7239C6"/>
     <w:multiLevelType w:val="multilevel"/>
     <w:tmpl w:val="430A31CA"/>
@@ -4717,7 +5196,7 @@
       </w:rPr>
     </w:lvl>
   </w:abstractNum>
-  <w:abstractNum w:abstractNumId="16" w15:restartNumberingAfterBreak="0">
+  <w:abstractNum w:abstractNumId="18" w15:restartNumberingAfterBreak="0">
     <w:nsid w:val="513F15CC"/>
     <w:multiLevelType w:val="multilevel"/>
     <w:tmpl w:val="CEE492BE"/>
@@ -4866,7 +5345,7 @@
       </w:rPr>
     </w:lvl>
   </w:abstractNum>
-  <w:abstractNum w:abstractNumId="17" w15:restartNumberingAfterBreak="0">
+  <w:abstractNum w:abstractNumId="19" w15:restartNumberingAfterBreak="0">
     <w:nsid w:val="58DA65B3"/>
     <w:multiLevelType w:val="hybridMultilevel"/>
     <w:tmpl w:val="8590815A"/>
@@ -4979,7 +5458,7 @@
       </w:rPr>
     </w:lvl>
   </w:abstractNum>
-  <w:abstractNum w:abstractNumId="18" w15:restartNumberingAfterBreak="0">
+  <w:abstractNum w:abstractNumId="20" w15:restartNumberingAfterBreak="0">
     <w:nsid w:val="592236A6"/>
     <w:multiLevelType w:val="hybridMultilevel"/>
     <w:tmpl w:val="5BBCC830"/>
@@ -5092,7 +5571,95 @@
       </w:rPr>
     </w:lvl>
   </w:abstractNum>
-  <w:abstractNum w:abstractNumId="19" w15:restartNumberingAfterBreak="0">
+  <w:abstractNum w:abstractNumId="21" w15:restartNumberingAfterBreak="0">
+    <w:nsid w:val="5E1A517D"/>
+    <w:multiLevelType w:val="hybridMultilevel"/>
+    <w:tmpl w:val="528E6788"/>
+    <w:lvl w:ilvl="0" w:tplc="EC4A6A06">
+      <w:numFmt w:val="bullet"/>
+      <w:lvlText w:val="-"/>
+      <w:lvlJc w:val="left"/>
+      <w:pPr>
+        <w:ind w:left="360" w:hanging="360"/>
+      </w:pPr>
+      <w:rPr>
+        <w:rFonts w:ascii="Cambria" w:eastAsiaTheme="minorEastAsia" w:hAnsi="Cambria" w:cstheme="minorBidi" w:hint="default"/>
+      </w:rPr>
+    </w:lvl>
+    <w:lvl w:ilvl="1" w:tplc="FFFFFFFF">
+      <w:start w:val="1"/>
+      <w:numFmt w:val="lowerLetter"/>
+      <w:lvlText w:val="%2."/>
+      <w:lvlJc w:val="left"/>
+      <w:pPr>
+        <w:ind w:left="1080" w:hanging="360"/>
+      </w:pPr>
+    </w:lvl>
+    <w:lvl w:ilvl="2" w:tplc="FFFFFFFF" w:tentative="1">
+      <w:start w:val="1"/>
+      <w:numFmt w:val="lowerRoman"/>
+      <w:lvlText w:val="%3."/>
+      <w:lvlJc w:val="right"/>
+      <w:pPr>
+        <w:ind w:left="1800" w:hanging="180"/>
+      </w:pPr>
+    </w:lvl>
+    <w:lvl w:ilvl="3" w:tplc="FFFFFFFF" w:tentative="1">
+      <w:start w:val="1"/>
+      <w:numFmt w:val="decimal"/>
+      <w:lvlText w:val="%4."/>
+      <w:lvlJc w:val="left"/>
+      <w:pPr>
+        <w:ind w:left="2520" w:hanging="360"/>
+      </w:pPr>
+    </w:lvl>
+    <w:lvl w:ilvl="4" w:tplc="FFFFFFFF" w:tentative="1">
+      <w:start w:val="1"/>
+      <w:numFmt w:val="lowerLetter"/>
+      <w:lvlText w:val="%5."/>
+      <w:lvlJc w:val="left"/>
+      <w:pPr>
+        <w:ind w:left="3240" w:hanging="360"/>
+      </w:pPr>
+    </w:lvl>
+    <w:lvl w:ilvl="5" w:tplc="FFFFFFFF" w:tentative="1">
+      <w:start w:val="1"/>
+      <w:numFmt w:val="lowerRoman"/>
+      <w:lvlText w:val="%6."/>
+      <w:lvlJc w:val="right"/>
+      <w:pPr>
+        <w:ind w:left="3960" w:hanging="180"/>
+      </w:pPr>
+    </w:lvl>
+    <w:lvl w:ilvl="6" w:tplc="FFFFFFFF" w:tentative="1">
+      <w:start w:val="1"/>
+      <w:numFmt w:val="decimal"/>
+      <w:lvlText w:val="%7."/>
+      <w:lvlJc w:val="left"/>
+      <w:pPr>
+        <w:ind w:left="4680" w:hanging="360"/>
+      </w:pPr>
+    </w:lvl>
+    <w:lvl w:ilvl="7" w:tplc="FFFFFFFF" w:tentative="1">
+      <w:start w:val="1"/>
+      <w:numFmt w:val="lowerLetter"/>
+      <w:lvlText w:val="%8."/>
+      <w:lvlJc w:val="left"/>
+      <w:pPr>
+        <w:ind w:left="5400" w:hanging="360"/>
+      </w:pPr>
+    </w:lvl>
+    <w:lvl w:ilvl="8" w:tplc="FFFFFFFF" w:tentative="1">
+      <w:start w:val="1"/>
+      <w:numFmt w:val="lowerRoman"/>
+      <w:lvlText w:val="%9."/>
+      <w:lvlJc w:val="right"/>
+      <w:pPr>
+        <w:ind w:left="6120" w:hanging="180"/>
+      </w:pPr>
+    </w:lvl>
+  </w:abstractNum>
+  <w:abstractNum w:abstractNumId="22" w15:restartNumberingAfterBreak="0">
     <w:nsid w:val="5F2968CC"/>
     <w:multiLevelType w:val="multilevel"/>
     <w:tmpl w:val="3126019E"/>
@@ -5241,7 +5808,7 @@
       </w:rPr>
     </w:lvl>
   </w:abstractNum>
-  <w:abstractNum w:abstractNumId="20" w15:restartNumberingAfterBreak="0">
+  <w:abstractNum w:abstractNumId="23" w15:restartNumberingAfterBreak="0">
     <w:nsid w:val="647F16D7"/>
     <w:multiLevelType w:val="hybridMultilevel"/>
     <w:tmpl w:val="DA0C7664"/>
@@ -5354,7 +5921,118 @@
       </w:rPr>
     </w:lvl>
   </w:abstractNum>
-  <w:abstractNum w:abstractNumId="21" w15:restartNumberingAfterBreak="0">
+  <w:abstractNum w:abstractNumId="24" w15:restartNumberingAfterBreak="0">
+    <w:nsid w:val="67877DF7"/>
+    <w:multiLevelType w:val="hybridMultilevel"/>
+    <w:tmpl w:val="ADF66AB8"/>
+    <w:lvl w:ilvl="0" w:tplc="FFFFFFFF">
+      <w:numFmt w:val="bullet"/>
+      <w:lvlText w:val="-"/>
+      <w:lvlJc w:val="left"/>
+      <w:pPr>
+        <w:ind w:left="360" w:hanging="360"/>
+      </w:pPr>
+      <w:rPr>
+        <w:rFonts w:ascii="Cambria" w:eastAsiaTheme="minorEastAsia" w:hAnsi="Cambria" w:cstheme="minorBidi" w:hint="default"/>
+      </w:rPr>
+    </w:lvl>
+    <w:lvl w:ilvl="1" w:tplc="5CC20546">
+      <w:numFmt w:val="bullet"/>
+      <w:lvlText w:val="&gt;"/>
+      <w:lvlJc w:val="left"/>
+      <w:pPr>
+        <w:ind w:left="1080" w:hanging="360"/>
+      </w:pPr>
+      <w:rPr>
+        <w:rFonts w:ascii="Cambria" w:eastAsiaTheme="minorEastAsia" w:hAnsi="Cambria" w:cstheme="minorBidi" w:hint="default"/>
+      </w:rPr>
+    </w:lvl>
+    <w:lvl w:ilvl="2" w:tplc="FFFFFFFF">
+      <w:start w:val="1"/>
+      <w:numFmt w:val="bullet"/>
+      <w:lvlText w:val=""/>
+      <w:lvlJc w:val="left"/>
+      <w:pPr>
+        <w:ind w:left="1800" w:hanging="360"/>
+      </w:pPr>
+      <w:rPr>
+        <w:rFonts w:ascii="Wingdings" w:hAnsi="Wingdings" w:hint="default"/>
+      </w:rPr>
+    </w:lvl>
+    <w:lvl w:ilvl="3" w:tplc="FFFFFFFF" w:tentative="1">
+      <w:start w:val="1"/>
+      <w:numFmt w:val="bullet"/>
+      <w:lvlText w:val=""/>
+      <w:lvlJc w:val="left"/>
+      <w:pPr>
+        <w:ind w:left="2520" w:hanging="360"/>
+      </w:pPr>
+      <w:rPr>
+        <w:rFonts w:ascii="Symbol" w:hAnsi="Symbol" w:hint="default"/>
+      </w:rPr>
+    </w:lvl>
+    <w:lvl w:ilvl="4" w:tplc="FFFFFFFF" w:tentative="1">
+      <w:start w:val="1"/>
+      <w:numFmt w:val="bullet"/>
+      <w:lvlText w:val="o"/>
+      <w:lvlJc w:val="left"/>
+      <w:pPr>
+        <w:ind w:left="3240" w:hanging="360"/>
+      </w:pPr>
+      <w:rPr>
+        <w:rFonts w:ascii="Courier New" w:hAnsi="Courier New" w:cs="Courier New" w:hint="default"/>
+      </w:rPr>
+    </w:lvl>
+    <w:lvl w:ilvl="5" w:tplc="FFFFFFFF" w:tentative="1">
+      <w:start w:val="1"/>
+      <w:numFmt w:val="bullet"/>
+      <w:lvlText w:val=""/>
+      <w:lvlJc w:val="left"/>
+      <w:pPr>
+        <w:ind w:left="3960" w:hanging="360"/>
+      </w:pPr>
+      <w:rPr>
+        <w:rFonts w:ascii="Wingdings" w:hAnsi="Wingdings" w:hint="default"/>
+      </w:rPr>
+    </w:lvl>
+    <w:lvl w:ilvl="6" w:tplc="FFFFFFFF" w:tentative="1">
+      <w:start w:val="1"/>
+      <w:numFmt w:val="bullet"/>
+      <w:lvlText w:val=""/>
+      <w:lvlJc w:val="left"/>
+      <w:pPr>
+        <w:ind w:left="4680" w:hanging="360"/>
+      </w:pPr>
+      <w:rPr>
+        <w:rFonts w:ascii="Symbol" w:hAnsi="Symbol" w:hint="default"/>
+      </w:rPr>
+    </w:lvl>
+    <w:lvl w:ilvl="7" w:tplc="FFFFFFFF" w:tentative="1">
+      <w:start w:val="1"/>
+      <w:numFmt w:val="bullet"/>
+      <w:lvlText w:val="o"/>
+      <w:lvlJc w:val="left"/>
+      <w:pPr>
+        <w:ind w:left="5400" w:hanging="360"/>
+      </w:pPr>
+      <w:rPr>
+        <w:rFonts w:ascii="Courier New" w:hAnsi="Courier New" w:cs="Courier New" w:hint="default"/>
+      </w:rPr>
+    </w:lvl>
+    <w:lvl w:ilvl="8" w:tplc="FFFFFFFF" w:tentative="1">
+      <w:start w:val="1"/>
+      <w:numFmt w:val="bullet"/>
+      <w:lvlText w:val=""/>
+      <w:lvlJc w:val="left"/>
+      <w:pPr>
+        <w:ind w:left="6120" w:hanging="360"/>
+      </w:pPr>
+      <w:rPr>
+        <w:rFonts w:ascii="Wingdings" w:hAnsi="Wingdings" w:hint="default"/>
+      </w:rPr>
+    </w:lvl>
+  </w:abstractNum>
+  <w:abstractNum w:abstractNumId="25" w15:restartNumberingAfterBreak="0">
     <w:nsid w:val="69C910EA"/>
     <w:multiLevelType w:val="multilevel"/>
     <w:tmpl w:val="3794AA6E"/>
@@ -5503,7 +6181,7 @@
       </w:rPr>
     </w:lvl>
   </w:abstractNum>
-  <w:abstractNum w:abstractNumId="22" w15:restartNumberingAfterBreak="0">
+  <w:abstractNum w:abstractNumId="26" w15:restartNumberingAfterBreak="0">
     <w:nsid w:val="6DFC1CC3"/>
     <w:multiLevelType w:val="multilevel"/>
     <w:tmpl w:val="3DA4473A"/>
@@ -5652,7 +6330,7 @@
       </w:rPr>
     </w:lvl>
   </w:abstractNum>
-  <w:abstractNum w:abstractNumId="23" w15:restartNumberingAfterBreak="0">
+  <w:abstractNum w:abstractNumId="27" w15:restartNumberingAfterBreak="0">
     <w:nsid w:val="718B3534"/>
     <w:multiLevelType w:val="multilevel"/>
     <w:tmpl w:val="87BA8846"/>
@@ -5801,7 +6479,7 @@
       </w:rPr>
     </w:lvl>
   </w:abstractNum>
-  <w:abstractNum w:abstractNumId="24" w15:restartNumberingAfterBreak="0">
+  <w:abstractNum w:abstractNumId="28" w15:restartNumberingAfterBreak="0">
     <w:nsid w:val="724349FD"/>
     <w:multiLevelType w:val="multilevel"/>
     <w:tmpl w:val="54EC775A"/>
@@ -5914,7 +6592,96 @@
       </w:pPr>
     </w:lvl>
   </w:abstractNum>
-  <w:abstractNum w:abstractNumId="25" w15:restartNumberingAfterBreak="0">
+  <w:abstractNum w:abstractNumId="29" w15:restartNumberingAfterBreak="0">
+    <w:nsid w:val="75C429A7"/>
+    <w:multiLevelType w:val="hybridMultilevel"/>
+    <w:tmpl w:val="6E10C314"/>
+    <w:lvl w:ilvl="0" w:tplc="040E000F">
+      <w:start w:val="1"/>
+      <w:numFmt w:val="decimal"/>
+      <w:lvlText w:val="%1."/>
+      <w:lvlJc w:val="left"/>
+      <w:pPr>
+        <w:ind w:left="360" w:hanging="360"/>
+      </w:pPr>
+      <w:rPr>
+        <w:rFonts w:hint="default"/>
+      </w:rPr>
+    </w:lvl>
+    <w:lvl w:ilvl="1" w:tplc="040E0019" w:tentative="1">
+      <w:start w:val="1"/>
+      <w:numFmt w:val="lowerLetter"/>
+      <w:lvlText w:val="%2."/>
+      <w:lvlJc w:val="left"/>
+      <w:pPr>
+        <w:ind w:left="1080" w:hanging="360"/>
+      </w:pPr>
+    </w:lvl>
+    <w:lvl w:ilvl="2" w:tplc="040E001B" w:tentative="1">
+      <w:start w:val="1"/>
+      <w:numFmt w:val="lowerRoman"/>
+      <w:lvlText w:val="%3."/>
+      <w:lvlJc w:val="right"/>
+      <w:pPr>
+        <w:ind w:left="1800" w:hanging="180"/>
+      </w:pPr>
+    </w:lvl>
+    <w:lvl w:ilvl="3" w:tplc="040E000F" w:tentative="1">
+      <w:start w:val="1"/>
+      <w:numFmt w:val="decimal"/>
+      <w:lvlText w:val="%4."/>
+      <w:lvlJc w:val="left"/>
+      <w:pPr>
+        <w:ind w:left="2520" w:hanging="360"/>
+      </w:pPr>
+    </w:lvl>
+    <w:lvl w:ilvl="4" w:tplc="040E0019" w:tentative="1">
+      <w:start w:val="1"/>
+      <w:numFmt w:val="lowerLetter"/>
+      <w:lvlText w:val="%5."/>
+      <w:lvlJc w:val="left"/>
+      <w:pPr>
+        <w:ind w:left="3240" w:hanging="360"/>
+      </w:pPr>
+    </w:lvl>
+    <w:lvl w:ilvl="5" w:tplc="040E001B" w:tentative="1">
+      <w:start w:val="1"/>
+      <w:numFmt w:val="lowerRoman"/>
+      <w:lvlText w:val="%6."/>
+      <w:lvlJc w:val="right"/>
+      <w:pPr>
+        <w:ind w:left="3960" w:hanging="180"/>
+      </w:pPr>
+    </w:lvl>
+    <w:lvl w:ilvl="6" w:tplc="040E000F" w:tentative="1">
+      <w:start w:val="1"/>
+      <w:numFmt w:val="decimal"/>
+      <w:lvlText w:val="%7."/>
+      <w:lvlJc w:val="left"/>
+      <w:pPr>
+        <w:ind w:left="4680" w:hanging="360"/>
+      </w:pPr>
+    </w:lvl>
+    <w:lvl w:ilvl="7" w:tplc="040E0019" w:tentative="1">
+      <w:start w:val="1"/>
+      <w:numFmt w:val="lowerLetter"/>
+      <w:lvlText w:val="%8."/>
+      <w:lvlJc w:val="left"/>
+      <w:pPr>
+        <w:ind w:left="5400" w:hanging="360"/>
+      </w:pPr>
+    </w:lvl>
+    <w:lvl w:ilvl="8" w:tplc="040E001B" w:tentative="1">
+      <w:start w:val="1"/>
+      <w:numFmt w:val="lowerRoman"/>
+      <w:lvlText w:val="%9."/>
+      <w:lvlJc w:val="right"/>
+      <w:pPr>
+        <w:ind w:left="6120" w:hanging="180"/>
+      </w:pPr>
+    </w:lvl>
+  </w:abstractNum>
+  <w:abstractNum w:abstractNumId="30" w15:restartNumberingAfterBreak="0">
     <w:nsid w:val="7FC738D0"/>
     <w:multiLevelType w:val="hybridMultilevel"/>
     <w:tmpl w:val="9C980206"/>
@@ -6027,89 +6794,104 @@
       </w:rPr>
     </w:lvl>
   </w:abstractNum>
-  <w:num w:numId="1">
+  <w:num w:numId="1" w16cid:durableId="1158183475">
     <w:abstractNumId w:val="0"/>
   </w:num>
-  <w:num w:numId="2">
+  <w:num w:numId="2" w16cid:durableId="1157306795">
+    <w:abstractNumId w:val="26"/>
+  </w:num>
+  <w:num w:numId="3" w16cid:durableId="1556819425">
+    <w:abstractNumId w:val="11"/>
+  </w:num>
+  <w:num w:numId="4" w16cid:durableId="345525872">
+    <w:abstractNumId w:val="16"/>
+  </w:num>
+  <w:num w:numId="5" w16cid:durableId="324014214">
+    <w:abstractNumId w:val="10"/>
+  </w:num>
+  <w:num w:numId="6" w16cid:durableId="335494951">
+    <w:abstractNumId w:val="23"/>
+  </w:num>
+  <w:num w:numId="7" w16cid:durableId="449982430">
     <w:abstractNumId w:val="22"/>
   </w:num>
-  <w:num w:numId="3">
-    <w:abstractNumId w:val="10"/>
+  <w:num w:numId="8" w16cid:durableId="1274439260">
+    <w:abstractNumId w:val="3"/>
   </w:num>
-  <w:num w:numId="4">
+  <w:num w:numId="9" w16cid:durableId="1316765477">
+    <w:abstractNumId w:val="6"/>
+  </w:num>
+  <w:num w:numId="10" w16cid:durableId="680398829">
+    <w:abstractNumId w:val="19"/>
+  </w:num>
+  <w:num w:numId="11" w16cid:durableId="1367291997">
+    <w:abstractNumId w:val="12"/>
+  </w:num>
+  <w:num w:numId="12" w16cid:durableId="1416245118">
+    <w:abstractNumId w:val="4"/>
+  </w:num>
+  <w:num w:numId="13" w16cid:durableId="565527458">
     <w:abstractNumId w:val="14"/>
   </w:num>
-  <w:num w:numId="5">
+  <w:num w:numId="14" w16cid:durableId="1825778847">
     <w:abstractNumId w:val="9"/>
   </w:num>
-  <w:num w:numId="6">
+  <w:num w:numId="15" w16cid:durableId="345912758">
+    <w:abstractNumId w:val="5"/>
+  </w:num>
+  <w:num w:numId="16" w16cid:durableId="1865093526">
+    <w:abstractNumId w:val="7"/>
+  </w:num>
+  <w:num w:numId="17" w16cid:durableId="308678906">
+    <w:abstractNumId w:val="27"/>
+  </w:num>
+  <w:num w:numId="18" w16cid:durableId="682973544">
+    <w:abstractNumId w:val="25"/>
+  </w:num>
+  <w:num w:numId="19" w16cid:durableId="728262132">
+    <w:abstractNumId w:val="13"/>
+  </w:num>
+  <w:num w:numId="20" w16cid:durableId="1620335844">
+    <w:abstractNumId w:val="17"/>
+  </w:num>
+  <w:num w:numId="21" w16cid:durableId="1843928916">
+    <w:abstractNumId w:val="18"/>
+  </w:num>
+  <w:num w:numId="22" w16cid:durableId="1893690805">
+    <w:abstractNumId w:val="2"/>
+  </w:num>
+  <w:num w:numId="23" w16cid:durableId="284970442">
+    <w:abstractNumId w:val="28"/>
+  </w:num>
+  <w:num w:numId="24" w16cid:durableId="2031758862">
+    <w:abstractNumId w:val="1"/>
+  </w:num>
+  <w:num w:numId="25" w16cid:durableId="26377657">
     <w:abstractNumId w:val="20"/>
   </w:num>
-  <w:num w:numId="7">
-    <w:abstractNumId w:val="19"/>
+  <w:num w:numId="26" w16cid:durableId="306709306">
+    <w:abstractNumId w:val="30"/>
   </w:num>
-  <w:num w:numId="8">
-    <w:abstractNumId w:val="3"/>
+  <w:num w:numId="27" w16cid:durableId="970748176">
+    <w:abstractNumId w:val="29"/>
   </w:num>
-  <w:num w:numId="9">
-    <w:abstractNumId w:val="6"/>
+  <w:num w:numId="28" w16cid:durableId="2090075220">
+    <w:abstractNumId w:val="21"/>
   </w:num>
-  <w:num w:numId="10">
-    <w:abstractNumId w:val="17"/>
-  </w:num>
-  <w:num w:numId="11">
-    <w:abstractNumId w:val="11"/>
-  </w:num>
-  <w:num w:numId="12">
-    <w:abstractNumId w:val="4"/>
-  </w:num>
-  <w:num w:numId="13">
-    <w:abstractNumId w:val="13"/>
-  </w:num>
-  <w:num w:numId="14">
+  <w:num w:numId="29" w16cid:durableId="500855462">
     <w:abstractNumId w:val="8"/>
   </w:num>
-  <w:num w:numId="15">
-    <w:abstractNumId w:val="5"/>
-  </w:num>
-  <w:num w:numId="16">
-    <w:abstractNumId w:val="7"/>
-  </w:num>
-  <w:num w:numId="17">
-    <w:abstractNumId w:val="23"/>
-  </w:num>
-  <w:num w:numId="18">
-    <w:abstractNumId w:val="21"/>
-  </w:num>
-  <w:num w:numId="19">
-    <w:abstractNumId w:val="12"/>
-  </w:num>
-  <w:num w:numId="20">
+  <w:num w:numId="30" w16cid:durableId="1835417553">
     <w:abstractNumId w:val="15"/>
   </w:num>
-  <w:num w:numId="21">
-    <w:abstractNumId w:val="16"/>
-  </w:num>
-  <w:num w:numId="22">
-    <w:abstractNumId w:val="2"/>
-  </w:num>
-  <w:num w:numId="23">
+  <w:num w:numId="31" w16cid:durableId="950018345">
     <w:abstractNumId w:val="24"/>
-  </w:num>
-  <w:num w:numId="24">
-    <w:abstractNumId w:val="1"/>
-  </w:num>
-  <w:num w:numId="25">
-    <w:abstractNumId w:val="18"/>
-  </w:num>
-  <w:num w:numId="26">
-    <w:abstractNumId w:val="25"/>
   </w:num>
 </w:numbering>
 </file>
 
 <file path=word/styles.xml><?xml version="1.0" encoding="utf-8"?>
-<w:styles xmlns:mc="http://schemas.openxmlformats.org/markup-compatibility/2006" xmlns:r="http://schemas.openxmlformats.org/officeDocument/2006/relationships" xmlns:w="http://schemas.openxmlformats.org/wordprocessingml/2006/main" xmlns:w14="http://schemas.microsoft.com/office/word/2010/wordml" xmlns:w15="http://schemas.microsoft.com/office/word/2012/wordml" xmlns:w16cex="http://schemas.microsoft.com/office/word/2018/wordml/cex" xmlns:w16cid="http://schemas.microsoft.com/office/word/2016/wordml/cid" xmlns:w16="http://schemas.microsoft.com/office/word/2018/wordml" xmlns:w16sdtdh="http://schemas.microsoft.com/office/word/2020/wordml/sdtdatahash" xmlns:w16se="http://schemas.microsoft.com/office/word/2015/wordml/symex" mc:Ignorable="w14 w15 w16se w16cid w16 w16cex w16sdtdh">
+<w:styles xmlns:mc="http://schemas.openxmlformats.org/markup-compatibility/2006" xmlns:r="http://schemas.openxmlformats.org/officeDocument/2006/relationships" xmlns:w="http://schemas.openxmlformats.org/wordprocessingml/2006/main" xmlns:w14="http://schemas.microsoft.com/office/word/2010/wordml" xmlns:w15="http://schemas.microsoft.com/office/word/2012/wordml" xmlns:w16cex="http://schemas.microsoft.com/office/word/2018/wordml/cex" xmlns:w16cid="http://schemas.microsoft.com/office/word/2016/wordml/cid" xmlns:w16="http://schemas.microsoft.com/office/word/2018/wordml" xmlns:w16du="http://schemas.microsoft.com/office/word/2023/wordml/word16du" xmlns:w16sdtdh="http://schemas.microsoft.com/office/word/2020/wordml/sdtdatahash" xmlns:w16sdtfl="http://schemas.microsoft.com/office/word/2024/wordml/sdtformatlock" xmlns:w16se="http://schemas.microsoft.com/office/word/2015/wordml/symex" mc:Ignorable="w14 w15 w16se w16cid w16 w16cex w16sdtdh w16sdtfl w16du">
   <w:docDefaults>
     <w:rPrDefault>
       <w:rPr>
@@ -7059,6 +7841,18 @@
       <w:shd w:val="clear" w:color="auto" w:fill="E1DFDD"/>
     </w:rPr>
   </w:style>
+  <w:style w:type="character" w:styleId="Mrltotthiperhivatkozs">
+    <w:name w:val="FollowedHyperlink"/>
+    <w:basedOn w:val="Bekezdsalapbettpusa"/>
+    <w:uiPriority w:val="99"/>
+    <w:semiHidden/>
+    <w:unhideWhenUsed/>
+    <w:rsid w:val="007B47EB"/>
+    <w:rPr>
+      <w:color w:val="96607D" w:themeColor="followedHyperlink"/>
+      <w:u w:val="single"/>
+    </w:rPr>
+  </w:style>
 </w:styles>
 </file>
 

</xml_diff>

<commit_message>
Dokumentáció javítás, példaadatok javítása
 - A felhasználói dokumentáció kiegészítése ügyfél és admin bejelentkezési adatokkal
 - A telepítési útmutató kiegészítése pár pontosítással
 - Egy normál körülmények között lehetetlen rögzített adat kijavítása
</commit_message>
<xml_diff>
--- a/docs/BalatonBeautySalon_felhasznaloi_dokumentacio.docx
+++ b/docs/BalatonBeautySalon_felhasznaloi_dokumentacio.docx
@@ -1962,9 +1962,23 @@
           <w:numId w:val="29"/>
         </w:numPr>
       </w:pPr>
+      <w:r>
+        <w:t xml:space="preserve">A </w:t>
+      </w:r>
+      <w:r>
+        <w:t xml:space="preserve">projekt mappán belül a </w:t>
+      </w:r>
+      <w:proofErr w:type="spellStart"/>
+      <w:r>
+        <w:t>BBSbackend</w:t>
+      </w:r>
+      <w:proofErr w:type="spellEnd"/>
+      <w:r>
+        <w:t xml:space="preserve"> mappában </w:t>
+      </w:r>
       <w:proofErr w:type="gramStart"/>
       <w:r>
-        <w:t xml:space="preserve">A </w:t>
+        <w:t xml:space="preserve">a </w:t>
       </w:r>
       <w:r>
         <w:rPr>
@@ -2103,13 +2117,27 @@
       <w:r>
         <w:t xml:space="preserve">A </w:t>
       </w:r>
+      <w:hyperlink r:id="rId14" w:history="1">
+        <w:r>
+          <w:rPr>
+            <w:rStyle w:val="Hiperhivatkozs"/>
+          </w:rPr>
+          <w:t>http://localhost/phpmyadmin/</w:t>
+        </w:r>
+      </w:hyperlink>
+      <w:r>
+        <w:t xml:space="preserve"> </w:t>
+      </w:r>
+      <w:r>
+        <w:t xml:space="preserve">oldalon a </w:t>
+      </w:r>
       <w:proofErr w:type="spellStart"/>
       <w:r>
         <w:rPr>
           <w:b/>
           <w:bCs/>
         </w:rPr>
-        <w:t>localhost</w:t>
+        <w:t>bbsbackend</w:t>
       </w:r>
       <w:proofErr w:type="spellEnd"/>
       <w:r>
@@ -2117,6 +2145,28 @@
           <w:b/>
           <w:bCs/>
         </w:rPr>
+        <w:t xml:space="preserve"> </w:t>
+      </w:r>
+      <w:r>
+        <w:t xml:space="preserve">adatbázis megnyitása, majd </w:t>
+      </w:r>
+      <w:r>
+        <w:t xml:space="preserve">az importálás menüpontban a </w:t>
+      </w:r>
+      <w:proofErr w:type="spellStart"/>
+      <w:r>
+        <w:rPr>
+          <w:b/>
+          <w:bCs/>
+        </w:rPr>
+        <w:t>projektmabba</w:t>
+      </w:r>
+      <w:proofErr w:type="spellEnd"/>
+      <w:r>
+        <w:rPr>
+          <w:b/>
+          <w:bCs/>
+        </w:rPr>
         <w:t>/</w:t>
       </w:r>
       <w:proofErr w:type="spellStart"/>
@@ -2125,7 +2175,7 @@
           <w:b/>
           <w:bCs/>
         </w:rPr>
-        <w:t>phpmyadmin</w:t>
+        <w:t>docs</w:t>
       </w:r>
       <w:proofErr w:type="spellEnd"/>
       <w:r>
@@ -2133,10 +2183,7 @@
           <w:b/>
           <w:bCs/>
         </w:rPr>
-        <w:t xml:space="preserve"> </w:t>
-      </w:r>
-      <w:r>
-        <w:t xml:space="preserve">oldalon a </w:t>
+        <w:t>/</w:t>
       </w:r>
       <w:proofErr w:type="spellStart"/>
       <w:r>
@@ -2144,68 +2191,7 @@
           <w:b/>
           <w:bCs/>
         </w:rPr>
-        <w:t>bbsbackend</w:t>
-      </w:r>
-      <w:proofErr w:type="spellEnd"/>
-      <w:r>
-        <w:rPr>
-          <w:b/>
-          <w:bCs/>
-        </w:rPr>
-        <w:t xml:space="preserve"> </w:t>
-      </w:r>
-      <w:r>
-        <w:t xml:space="preserve">adatbázis megnyitása, majd </w:t>
-      </w:r>
-      <w:r>
-        <w:t xml:space="preserve">az importálás menüpontban a </w:t>
-      </w:r>
-      <w:proofErr w:type="spellStart"/>
-      <w:r>
-        <w:rPr>
-          <w:b/>
-          <w:bCs/>
-        </w:rPr>
-        <w:t>projektmabba</w:t>
-      </w:r>
-      <w:proofErr w:type="spellEnd"/>
-      <w:r>
-        <w:rPr>
-          <w:b/>
-          <w:bCs/>
-        </w:rPr>
-        <w:t>/</w:t>
-      </w:r>
-      <w:proofErr w:type="spellStart"/>
-      <w:r>
-        <w:rPr>
-          <w:b/>
-          <w:bCs/>
-        </w:rPr>
-        <w:t>docs</w:t>
-      </w:r>
-      <w:proofErr w:type="spellEnd"/>
-      <w:r>
-        <w:rPr>
-          <w:b/>
-          <w:bCs/>
-        </w:rPr>
-        <w:t>/</w:t>
-      </w:r>
-      <w:proofErr w:type="spellStart"/>
-      <w:r>
-        <w:rPr>
-          <w:b/>
-          <w:bCs/>
-        </w:rPr>
-        <w:t>BBSBackendDatas</w:t>
-      </w:r>
-      <w:r>
-        <w:rPr>
-          <w:b/>
-          <w:bCs/>
-        </w:rPr>
-        <w:t>.sql</w:t>
+        <w:t>BBSBackendDatas.sql</w:t>
       </w:r>
       <w:proofErr w:type="spellEnd"/>
       <w:r>
@@ -2732,24 +2718,12 @@
       <w:r>
         <w:t xml:space="preserve"> felület: </w:t>
       </w:r>
-      <w:hyperlink r:id="rId14" w:history="1">
+      <w:hyperlink r:id="rId15" w:history="1">
         <w:r>
           <w:rPr>
             <w:rStyle w:val="Hiperhivatkozs"/>
           </w:rPr>
-          <w:t>http://localhost:5173</w:t>
-        </w:r>
-        <w:r>
-          <w:rPr>
-            <w:rStyle w:val="Hiperhivatkozs"/>
-          </w:rPr>
-          <w:t>/</w:t>
-        </w:r>
-        <w:r>
-          <w:rPr>
-            <w:rStyle w:val="Hiperhivatkozs"/>
-          </w:rPr>
-          <w:t>login</w:t>
+          <w:t>http://localhost:5173/login</w:t>
         </w:r>
       </w:hyperlink>
       <w:r>
@@ -2769,7 +2743,7 @@
       <w:r>
         <w:t xml:space="preserve"> </w:t>
       </w:r>
-      <w:hyperlink r:id="rId15" w:history="1">
+      <w:hyperlink r:id="rId16" w:history="1">
         <w:r>
           <w:rPr>
             <w:rStyle w:val="Hiperhivatkozs"/>
@@ -2777,6 +2751,357 @@
           <w:t>http://localhost:5173/admin/login</w:t>
         </w:r>
       </w:hyperlink>
+    </w:p>
+    <w:p>
+      <w:r>
+        <w:br w:type="page"/>
+      </w:r>
+    </w:p>
+    <w:p>
+      <w:r>
+        <w:lastRenderedPageBreak/>
+        <w:t>Ügyfél</w:t>
+      </w:r>
+      <w:r>
+        <w:t xml:space="preserve"> </w:t>
+      </w:r>
+      <w:r>
+        <w:t>felhasználó</w:t>
+      </w:r>
+      <w:r>
+        <w:t>k</w:t>
+      </w:r>
+      <w:r>
+        <w:t xml:space="preserve"> </w:t>
+      </w:r>
+      <w:r>
+        <w:rPr>
+          <w:b/>
+          <w:bCs/>
+        </w:rPr>
+        <w:br/>
+      </w:r>
+      <w:proofErr w:type="spellStart"/>
+      <w:r>
+        <w:t>Emailek</w:t>
+      </w:r>
+      <w:proofErr w:type="spellEnd"/>
+      <w:r>
+        <w:t>:</w:t>
+      </w:r>
+    </w:p>
+    <w:tbl>
+      <w:tblPr>
+        <w:tblStyle w:val="Rcsostblzat"/>
+        <w:tblW w:w="0" w:type="auto"/>
+        <w:tblLook w:val="04A0" w:firstRow="1" w:lastRow="0" w:firstColumn="1" w:lastColumn="0" w:noHBand="0" w:noVBand="1"/>
+      </w:tblPr>
+      <w:tblGrid>
+        <w:gridCol w:w="3485"/>
+        <w:gridCol w:w="3485"/>
+        <w:gridCol w:w="3486"/>
+      </w:tblGrid>
+      <w:tr>
+        <w:tc>
+          <w:tcPr>
+            <w:tcW w:w="3485" w:type="dxa"/>
+          </w:tcPr>
+          <w:p>
+            <w:pPr>
+              <w:rPr>
+                <w:b/>
+                <w:bCs/>
+              </w:rPr>
+            </w:pPr>
+            <w:r>
+              <w:rPr>
+                <w:b/>
+                <w:bCs/>
+              </w:rPr>
+              <w:t>molnar.noemi@example.com</w:t>
+            </w:r>
+          </w:p>
+        </w:tc>
+        <w:tc>
+          <w:tcPr>
+            <w:tcW w:w="3485" w:type="dxa"/>
+          </w:tcPr>
+          <w:p>
+            <w:pPr>
+              <w:rPr>
+                <w:b/>
+                <w:bCs/>
+              </w:rPr>
+            </w:pPr>
+            <w:r>
+              <w:rPr>
+                <w:b/>
+                <w:bCs/>
+              </w:rPr>
+              <w:t>farkas.vivien@example.com</w:t>
+            </w:r>
+          </w:p>
+        </w:tc>
+        <w:tc>
+          <w:tcPr>
+            <w:tcW w:w="3486" w:type="dxa"/>
+          </w:tcPr>
+          <w:p>
+            <w:pPr>
+              <w:rPr>
+                <w:b/>
+                <w:bCs/>
+              </w:rPr>
+            </w:pPr>
+            <w:r>
+              <w:rPr>
+                <w:b/>
+                <w:bCs/>
+              </w:rPr>
+              <w:t>horvath.anna@example.com</w:t>
+            </w:r>
+          </w:p>
+        </w:tc>
+      </w:tr>
+      <w:tr>
+        <w:tc>
+          <w:tcPr>
+            <w:tcW w:w="3485" w:type="dxa"/>
+          </w:tcPr>
+          <w:p>
+            <w:pPr>
+              <w:rPr>
+                <w:b/>
+                <w:bCs/>
+              </w:rPr>
+            </w:pPr>
+            <w:r>
+              <w:rPr>
+                <w:b/>
+                <w:bCs/>
+              </w:rPr>
+              <w:t>kovacs.tamas@example.com</w:t>
+            </w:r>
+          </w:p>
+        </w:tc>
+        <w:tc>
+          <w:tcPr>
+            <w:tcW w:w="3485" w:type="dxa"/>
+          </w:tcPr>
+          <w:p>
+            <w:pPr>
+              <w:rPr>
+                <w:b/>
+                <w:bCs/>
+              </w:rPr>
+            </w:pPr>
+            <w:r>
+              <w:rPr>
+                <w:b/>
+                <w:bCs/>
+              </w:rPr>
+              <w:t>nagy.zita@example.com</w:t>
+            </w:r>
+          </w:p>
+        </w:tc>
+        <w:tc>
+          <w:tcPr>
+            <w:tcW w:w="3486" w:type="dxa"/>
+          </w:tcPr>
+          <w:p>
+            <w:pPr>
+              <w:rPr>
+                <w:b/>
+                <w:bCs/>
+              </w:rPr>
+            </w:pPr>
+            <w:r>
+              <w:rPr>
+                <w:b/>
+                <w:bCs/>
+              </w:rPr>
+              <w:t>toth.lilla@example.com</w:t>
+            </w:r>
+          </w:p>
+        </w:tc>
+      </w:tr>
+      <w:tr>
+        <w:tc>
+          <w:tcPr>
+            <w:tcW w:w="3485" w:type="dxa"/>
+          </w:tcPr>
+          <w:p>
+            <w:pPr>
+              <w:rPr>
+                <w:b/>
+                <w:bCs/>
+              </w:rPr>
+            </w:pPr>
+            <w:r>
+              <w:rPr>
+                <w:b/>
+                <w:bCs/>
+              </w:rPr>
+              <w:t>szabo.vivien@example.com</w:t>
+            </w:r>
+          </w:p>
+        </w:tc>
+        <w:tc>
+          <w:tcPr>
+            <w:tcW w:w="3485" w:type="dxa"/>
+          </w:tcPr>
+          <w:p>
+            <w:pPr>
+              <w:rPr>
+                <w:b/>
+                <w:bCs/>
+              </w:rPr>
+            </w:pPr>
+            <w:r>
+              <w:rPr>
+                <w:b/>
+                <w:bCs/>
+              </w:rPr>
+              <w:t>kiss.noemi@example.com</w:t>
+            </w:r>
+          </w:p>
+        </w:tc>
+        <w:tc>
+          <w:tcPr>
+            <w:tcW w:w="3486" w:type="dxa"/>
+          </w:tcPr>
+          <w:p>
+            <w:pPr>
+              <w:rPr>
+                <w:b/>
+                <w:bCs/>
+              </w:rPr>
+            </w:pPr>
+            <w:r>
+              <w:rPr>
+                <w:b/>
+                <w:bCs/>
+              </w:rPr>
+              <w:t>varga.petra@example.com</w:t>
+            </w:r>
+          </w:p>
+        </w:tc>
+      </w:tr>
+      <w:tr>
+        <w:tc>
+          <w:tcPr>
+            <w:tcW w:w="3485" w:type="dxa"/>
+          </w:tcPr>
+          <w:p>
+            <w:pPr>
+              <w:rPr>
+                <w:b/>
+                <w:bCs/>
+              </w:rPr>
+            </w:pPr>
+            <w:r>
+              <w:rPr>
+                <w:b/>
+                <w:bCs/>
+              </w:rPr>
+              <w:t>kiss.eszter@example.com</w:t>
+            </w:r>
+          </w:p>
+        </w:tc>
+        <w:tc>
+          <w:tcPr>
+            <w:tcW w:w="3485" w:type="dxa"/>
+          </w:tcPr>
+          <w:p>
+            <w:pPr>
+              <w:rPr>
+                <w:b/>
+                <w:bCs/>
+              </w:rPr>
+            </w:pPr>
+            <w:r>
+              <w:rPr>
+                <w:b/>
+                <w:bCs/>
+              </w:rPr>
+              <w:t>szabo.klaudia@example.com</w:t>
+            </w:r>
+          </w:p>
+        </w:tc>
+        <w:tc>
+          <w:tcPr>
+            <w:tcW w:w="3486" w:type="dxa"/>
+          </w:tcPr>
+          <w:p>
+            <w:pPr>
+              <w:rPr>
+                <w:b/>
+                <w:bCs/>
+              </w:rPr>
+            </w:pPr>
+            <w:r>
+              <w:rPr>
+                <w:b/>
+                <w:bCs/>
+              </w:rPr>
+              <w:t>nagy.david@example.com</w:t>
+            </w:r>
+          </w:p>
+        </w:tc>
+      </w:tr>
+    </w:tbl>
+    <w:p>
+      <w:r>
+        <w:t xml:space="preserve">Jelszó: </w:t>
+      </w:r>
+      <w:r>
+        <w:rPr>
+          <w:b/>
+          <w:bCs/>
+        </w:rPr>
+        <w:t>Default123</w:t>
+      </w:r>
+    </w:p>
+    <w:p>
+      <w:proofErr w:type="spellStart"/>
+      <w:r>
+        <w:t>Admin</w:t>
+      </w:r>
+      <w:proofErr w:type="spellEnd"/>
+      <w:r>
+        <w:t xml:space="preserve"> felhasználó</w:t>
+      </w:r>
+      <w:r>
+        <w:br/>
+        <w:t xml:space="preserve">Email: </w:t>
+      </w:r>
+      <w:r>
+        <w:rPr>
+          <w:b/>
+          <w:bCs/>
+        </w:rPr>
+        <w:t>admin@example.com</w:t>
+      </w:r>
+      <w:r>
+        <w:rPr>
+          <w:b/>
+          <w:bCs/>
+        </w:rPr>
+        <w:tab/>
+      </w:r>
+      <w:r>
+        <w:br/>
+        <w:t xml:space="preserve">Jelszó: </w:t>
+      </w:r>
+      <w:proofErr w:type="spellStart"/>
+      <w:r>
+        <w:rPr>
+          <w:b/>
+          <w:bCs/>
+        </w:rPr>
+        <w:t>admin</w:t>
+      </w:r>
+      <w:proofErr w:type="spellEnd"/>
     </w:p>
     <w:sectPr>
       <w:pgSz w:w="11906" w:h="16838"/>
@@ -7853,6 +8178,25 @@
       <w:u w:val="single"/>
     </w:rPr>
   </w:style>
+  <w:style w:type="table" w:styleId="Rcsostblzat">
+    <w:name w:val="Table Grid"/>
+    <w:basedOn w:val="Normltblzat"/>
+    <w:uiPriority w:val="39"/>
+    <w:rsid w:val="00A32127"/>
+    <w:pPr>
+      <w:spacing w:after="0" w:line="240" w:lineRule="auto"/>
+    </w:pPr>
+    <w:tblPr>
+      <w:tblBorders>
+        <w:top w:val="single" w:sz="4" w:space="0" w:color="auto"/>
+        <w:left w:val="single" w:sz="4" w:space="0" w:color="auto"/>
+        <w:bottom w:val="single" w:sz="4" w:space="0" w:color="auto"/>
+        <w:right w:val="single" w:sz="4" w:space="0" w:color="auto"/>
+        <w:insideH w:val="single" w:sz="4" w:space="0" w:color="auto"/>
+        <w:insideV w:val="single" w:sz="4" w:space="0" w:color="auto"/>
+      </w:tblBorders>
+    </w:tblPr>
+  </w:style>
 </w:styles>
 </file>
 

</xml_diff>

<commit_message>
Admin oldal gyorsműveletek javítása
Kijavítottam az AdminHome.jsx-ben a gyorsműveletek részt, mivel észrevettem, hogy a gombokhoz nincsenek hozzárendelve a modal-ok
Valamint a felhasználói dokumentációban javítottam egy elírást
</commit_message>
<xml_diff>
--- a/docs/BalatonBeautySalon_felhasznaloi_dokumentacio.docx
+++ b/docs/BalatonBeautySalon_felhasznaloi_dokumentacio.docx
@@ -1,6 +1,6 @@
 
 <file path=word/document.xml><?xml version="1.0" encoding="utf-8"?>
-<w:document xmlns:wpc="http://schemas.microsoft.com/office/word/2010/wordprocessingCanvas" xmlns:cx="http://schemas.microsoft.com/office/drawing/2014/chartex" xmlns:cx1="http://schemas.microsoft.com/office/drawing/2015/9/8/chartex" xmlns:cx2="http://schemas.microsoft.com/office/drawing/2015/10/21/chartex" xmlns:cx3="http://schemas.microsoft.com/office/drawing/2016/5/9/chartex" xmlns:cx4="http://schemas.microsoft.com/office/drawing/2016/5/10/chartex" xmlns:cx5="http://schemas.microsoft.com/office/drawing/2016/5/11/chartex" xmlns:cx6="http://schemas.microsoft.com/office/drawing/2016/5/12/chartex" xmlns:cx7="http://schemas.microsoft.com/office/drawing/2016/5/13/chartex" xmlns:cx8="http://schemas.microsoft.com/office/drawing/2016/5/14/chartex" xmlns:mc="http://schemas.openxmlformats.org/markup-compatibility/2006" xmlns:aink="http://schemas.microsoft.com/office/drawing/2016/ink" xmlns:am3d="http://schemas.microsoft.com/office/drawing/2017/model3d" xmlns:o="urn:schemas-microsoft-com:office:office" xmlns:oel="http://schemas.microsoft.com/office/2019/extlst" xmlns:r="http://schemas.openxmlformats.org/officeDocument/2006/relationships" xmlns:m="http://schemas.openxmlformats.org/officeDocument/2006/math" xmlns:v="urn:schemas-microsoft-com:vml" xmlns:wp14="http://schemas.microsoft.com/office/word/2010/wordprocessingDrawing" xmlns:wp="http://schemas.openxmlformats.org/drawingml/2006/wordprocessingDrawing" xmlns:w10="urn:schemas-microsoft-com:office:word" xmlns:w="http://schemas.openxmlformats.org/wordprocessingml/2006/main" xmlns:w14="http://schemas.microsoft.com/office/word/2010/wordml" xmlns:w15="http://schemas.microsoft.com/office/word/2012/wordml" xmlns:w16cex="http://schemas.microsoft.com/office/word/2018/wordml/cex" xmlns:w16cid="http://schemas.microsoft.com/office/word/2016/wordml/cid" xmlns:w16="http://schemas.microsoft.com/office/word/2018/wordml" xmlns:w16du="http://schemas.microsoft.com/office/word/2023/wordml/word16du" xmlns:w16sdtdh="http://schemas.microsoft.com/office/word/2020/wordml/sdtdatahash" xmlns:w16sdtfl="http://schemas.microsoft.com/office/word/2024/wordml/sdtformatlock" xmlns:w16se="http://schemas.microsoft.com/office/word/2015/wordml/symex" xmlns:wpg="http://schemas.microsoft.com/office/word/2010/wordprocessingGroup" xmlns:wpi="http://schemas.microsoft.com/office/word/2010/wordprocessingInk" xmlns:wne="http://schemas.microsoft.com/office/word/2006/wordml" xmlns:wps="http://schemas.microsoft.com/office/word/2010/wordprocessingShape" mc:Ignorable="w14 w15 w16se w16cid w16 w16cex w16sdtdh w16sdtfl w16du wp14">
+<w:document xmlns:wpc="http://schemas.microsoft.com/office/word/2010/wordprocessingCanvas" xmlns:cx="http://schemas.microsoft.com/office/drawing/2014/chartex" xmlns:cx1="http://schemas.microsoft.com/office/drawing/2015/9/8/chartex" xmlns:cx2="http://schemas.microsoft.com/office/drawing/2015/10/21/chartex" xmlns:cx3="http://schemas.microsoft.com/office/drawing/2016/5/9/chartex" xmlns:cx4="http://schemas.microsoft.com/office/drawing/2016/5/10/chartex" xmlns:cx5="http://schemas.microsoft.com/office/drawing/2016/5/11/chartex" xmlns:cx6="http://schemas.microsoft.com/office/drawing/2016/5/12/chartex" xmlns:cx7="http://schemas.microsoft.com/office/drawing/2016/5/13/chartex" xmlns:cx8="http://schemas.microsoft.com/office/drawing/2016/5/14/chartex" xmlns:mc="http://schemas.openxmlformats.org/markup-compatibility/2006" xmlns:aink="http://schemas.microsoft.com/office/drawing/2016/ink" xmlns:am3d="http://schemas.microsoft.com/office/drawing/2017/model3d" xmlns:o="urn:schemas-microsoft-com:office:office" xmlns:r="http://schemas.openxmlformats.org/officeDocument/2006/relationships" xmlns:m="http://schemas.openxmlformats.org/officeDocument/2006/math" xmlns:v="urn:schemas-microsoft-com:vml" xmlns:wp14="http://schemas.microsoft.com/office/word/2010/wordprocessingDrawing" xmlns:wp="http://schemas.openxmlformats.org/drawingml/2006/wordprocessingDrawing" xmlns:w10="urn:schemas-microsoft-com:office:word" xmlns:w="http://schemas.openxmlformats.org/wordprocessingml/2006/main" xmlns:w14="http://schemas.microsoft.com/office/word/2010/wordml" xmlns:w15="http://schemas.microsoft.com/office/word/2012/wordml" xmlns:w16cex="http://schemas.microsoft.com/office/word/2018/wordml/cex" xmlns:w16cid="http://schemas.microsoft.com/office/word/2016/wordml/cid" xmlns:w16="http://schemas.microsoft.com/office/word/2018/wordml" xmlns:w16sdtdh="http://schemas.microsoft.com/office/word/2020/wordml/sdtdatahash" xmlns:w16se="http://schemas.microsoft.com/office/word/2015/wordml/symex" xmlns:wpg="http://schemas.microsoft.com/office/word/2010/wordprocessingGroup" xmlns:wpi="http://schemas.microsoft.com/office/word/2010/wordprocessingInk" xmlns:wne="http://schemas.microsoft.com/office/word/2006/wordml" xmlns:wps="http://schemas.microsoft.com/office/word/2010/wordprocessingShape" mc:Ignorable="w14 w15 w16se w16cid w16 w16cex w16sdtdh wp14">
   <w:body>
     <w:p>
       <w:pPr>
@@ -1974,11 +1974,7 @@
       </w:r>
       <w:proofErr w:type="spellEnd"/>
       <w:r>
-        <w:t xml:space="preserve"> mappában </w:t>
-      </w:r>
-      <w:proofErr w:type="gramStart"/>
-      <w:r>
-        <w:t xml:space="preserve">a </w:t>
+        <w:t xml:space="preserve"> mappában a </w:t>
       </w:r>
       <w:r>
         <w:rPr>
@@ -1993,15 +1989,7 @@
           <w:b/>
           <w:bCs/>
         </w:rPr>
-        <w:t>env</w:t>
-      </w:r>
-      <w:proofErr w:type="gramEnd"/>
-      <w:r>
-        <w:rPr>
-          <w:b/>
-          <w:bCs/>
-        </w:rPr>
-        <w:t>.example</w:t>
+        <w:t>env.example</w:t>
       </w:r>
       <w:proofErr w:type="spellEnd"/>
       <w:r>
@@ -2153,13 +2141,34 @@
       <w:r>
         <w:t xml:space="preserve">az importálás menüpontban a </w:t>
       </w:r>
+      <w:r>
+        <w:rPr>
+          <w:b/>
+          <w:bCs/>
+        </w:rPr>
+        <w:t>projektma</w:t>
+      </w:r>
+      <w:r>
+        <w:rPr>
+          <w:b/>
+          <w:bCs/>
+        </w:rPr>
+        <w:t>pp</w:t>
+      </w:r>
+      <w:r>
+        <w:rPr>
+          <w:b/>
+          <w:bCs/>
+        </w:rPr>
+        <w:t>a/</w:t>
+      </w:r>
       <w:proofErr w:type="spellStart"/>
       <w:r>
         <w:rPr>
           <w:b/>
           <w:bCs/>
         </w:rPr>
-        <w:t>projektmabba</w:t>
+        <w:t>docs</w:t>
       </w:r>
       <w:proofErr w:type="spellEnd"/>
       <w:r>
@@ -2175,7 +2184,7 @@
           <w:b/>
           <w:bCs/>
         </w:rPr>
-        <w:t>docs</w:t>
+        <w:t>BBSBackendDatas.sql</w:t>
       </w:r>
       <w:proofErr w:type="spellEnd"/>
       <w:r>
@@ -2183,32 +2192,14 @@
           <w:b/>
           <w:bCs/>
         </w:rPr>
-        <w:t>/</w:t>
-      </w:r>
-      <w:proofErr w:type="spellStart"/>
-      <w:r>
-        <w:rPr>
-          <w:b/>
-          <w:bCs/>
-        </w:rPr>
-        <w:t>BBSBackendDatas.sql</w:t>
-      </w:r>
-      <w:proofErr w:type="spellEnd"/>
-      <w:r>
-        <w:rPr>
-          <w:b/>
-          <w:bCs/>
-        </w:rPr>
         <w:t xml:space="preserve"> </w:t>
       </w:r>
-      <w:proofErr w:type="gramStart"/>
       <w:r>
         <w:t>importálása</w:t>
       </w:r>
       <w:r>
         <w:t>,.</w:t>
       </w:r>
-      <w:proofErr w:type="gramEnd"/>
     </w:p>
     <w:p>
       <w:pPr>
@@ -2709,14 +2700,7 @@
     <w:p>
       <w:r>
         <w:tab/>
-      </w:r>
-      <w:proofErr w:type="spellStart"/>
-      <w:r>
-        <w:t>User</w:t>
-      </w:r>
-      <w:proofErr w:type="spellEnd"/>
-      <w:r>
-        <w:t xml:space="preserve"> felület: </w:t>
+        <w:t xml:space="preserve">User felület: </w:t>
       </w:r>
       <w:hyperlink r:id="rId15" w:history="1">
         <w:r>
@@ -3114,7 +3098,7 @@
 </file>
 
 <file path=word/numbering.xml><?xml version="1.0" encoding="utf-8"?>
-<w:numbering xmlns:wpc="http://schemas.microsoft.com/office/word/2010/wordprocessingCanvas" xmlns:cx="http://schemas.microsoft.com/office/drawing/2014/chartex" xmlns:cx1="http://schemas.microsoft.com/office/drawing/2015/9/8/chartex" xmlns:cx2="http://schemas.microsoft.com/office/drawing/2015/10/21/chartex" xmlns:cx3="http://schemas.microsoft.com/office/drawing/2016/5/9/chartex" xmlns:cx4="http://schemas.microsoft.com/office/drawing/2016/5/10/chartex" xmlns:cx5="http://schemas.microsoft.com/office/drawing/2016/5/11/chartex" xmlns:cx6="http://schemas.microsoft.com/office/drawing/2016/5/12/chartex" xmlns:cx7="http://schemas.microsoft.com/office/drawing/2016/5/13/chartex" xmlns:cx8="http://schemas.microsoft.com/office/drawing/2016/5/14/chartex" xmlns:mc="http://schemas.openxmlformats.org/markup-compatibility/2006" xmlns:aink="http://schemas.microsoft.com/office/drawing/2016/ink" xmlns:am3d="http://schemas.microsoft.com/office/drawing/2017/model3d" xmlns:o="urn:schemas-microsoft-com:office:office" xmlns:oel="http://schemas.microsoft.com/office/2019/extlst" xmlns:r="http://schemas.openxmlformats.org/officeDocument/2006/relationships" xmlns:m="http://schemas.openxmlformats.org/officeDocument/2006/math" xmlns:v="urn:schemas-microsoft-com:vml" xmlns:wp14="http://schemas.microsoft.com/office/word/2010/wordprocessingDrawing" xmlns:wp="http://schemas.openxmlformats.org/drawingml/2006/wordprocessingDrawing" xmlns:w10="urn:schemas-microsoft-com:office:word" xmlns:w="http://schemas.openxmlformats.org/wordprocessingml/2006/main" xmlns:w14="http://schemas.microsoft.com/office/word/2010/wordml" xmlns:w15="http://schemas.microsoft.com/office/word/2012/wordml" xmlns:w16cex="http://schemas.microsoft.com/office/word/2018/wordml/cex" xmlns:w16cid="http://schemas.microsoft.com/office/word/2016/wordml/cid" xmlns:w16="http://schemas.microsoft.com/office/word/2018/wordml" xmlns:w16du="http://schemas.microsoft.com/office/word/2023/wordml/word16du" xmlns:w16sdtdh="http://schemas.microsoft.com/office/word/2020/wordml/sdtdatahash" xmlns:w16sdtfl="http://schemas.microsoft.com/office/word/2024/wordml/sdtformatlock" xmlns:w16se="http://schemas.microsoft.com/office/word/2015/wordml/symex" xmlns:wpg="http://schemas.microsoft.com/office/word/2010/wordprocessingGroup" xmlns:wpi="http://schemas.microsoft.com/office/word/2010/wordprocessingInk" xmlns:wne="http://schemas.microsoft.com/office/word/2006/wordml" xmlns:wps="http://schemas.microsoft.com/office/word/2010/wordprocessingShape" mc:Ignorable="w14 w15 w16se w16cid w16 w16cex w16sdtdh w16sdtfl w16du wp14">
+<w:numbering xmlns:wpc="http://schemas.microsoft.com/office/word/2010/wordprocessingCanvas" xmlns:cx="http://schemas.microsoft.com/office/drawing/2014/chartex" xmlns:cx1="http://schemas.microsoft.com/office/drawing/2015/9/8/chartex" xmlns:cx2="http://schemas.microsoft.com/office/drawing/2015/10/21/chartex" xmlns:cx3="http://schemas.microsoft.com/office/drawing/2016/5/9/chartex" xmlns:cx4="http://schemas.microsoft.com/office/drawing/2016/5/10/chartex" xmlns:cx5="http://schemas.microsoft.com/office/drawing/2016/5/11/chartex" xmlns:cx6="http://schemas.microsoft.com/office/drawing/2016/5/12/chartex" xmlns:cx7="http://schemas.microsoft.com/office/drawing/2016/5/13/chartex" xmlns:cx8="http://schemas.microsoft.com/office/drawing/2016/5/14/chartex" xmlns:mc="http://schemas.openxmlformats.org/markup-compatibility/2006" xmlns:aink="http://schemas.microsoft.com/office/drawing/2016/ink" xmlns:am3d="http://schemas.microsoft.com/office/drawing/2017/model3d" xmlns:o="urn:schemas-microsoft-com:office:office" xmlns:r="http://schemas.openxmlformats.org/officeDocument/2006/relationships" xmlns:m="http://schemas.openxmlformats.org/officeDocument/2006/math" xmlns:v="urn:schemas-microsoft-com:vml" xmlns:wp14="http://schemas.microsoft.com/office/word/2010/wordprocessingDrawing" xmlns:wp="http://schemas.openxmlformats.org/drawingml/2006/wordprocessingDrawing" xmlns:w10="urn:schemas-microsoft-com:office:word" xmlns:w="http://schemas.openxmlformats.org/wordprocessingml/2006/main" xmlns:w14="http://schemas.microsoft.com/office/word/2010/wordml" xmlns:w15="http://schemas.microsoft.com/office/word/2012/wordml" xmlns:w16cex="http://schemas.microsoft.com/office/word/2018/wordml/cex" xmlns:w16cid="http://schemas.microsoft.com/office/word/2016/wordml/cid" xmlns:w16="http://schemas.microsoft.com/office/word/2018/wordml" xmlns:w16sdtdh="http://schemas.microsoft.com/office/word/2020/wordml/sdtdatahash" xmlns:w16se="http://schemas.microsoft.com/office/word/2015/wordml/symex" xmlns:wpg="http://schemas.microsoft.com/office/word/2010/wordprocessingGroup" xmlns:wpi="http://schemas.microsoft.com/office/word/2010/wordprocessingInk" xmlns:wne="http://schemas.microsoft.com/office/word/2006/wordml" xmlns:wps="http://schemas.microsoft.com/office/word/2010/wordprocessingShape" mc:Ignorable="w14 w15 w16se w16cid w16 w16cex w16sdtdh wp14">
   <w:abstractNum w:abstractNumId="0" w15:restartNumberingAfterBreak="0">
     <w:nsid w:val="0C357CDE"/>
     <w:multiLevelType w:val="multilevel"/>
@@ -7119,104 +7103,104 @@
       </w:rPr>
     </w:lvl>
   </w:abstractNum>
-  <w:num w:numId="1" w16cid:durableId="1158183475">
+  <w:num w:numId="1">
     <w:abstractNumId w:val="0"/>
   </w:num>
-  <w:num w:numId="2" w16cid:durableId="1157306795">
+  <w:num w:numId="2">
     <w:abstractNumId w:val="26"/>
   </w:num>
-  <w:num w:numId="3" w16cid:durableId="1556819425">
+  <w:num w:numId="3">
     <w:abstractNumId w:val="11"/>
   </w:num>
-  <w:num w:numId="4" w16cid:durableId="345525872">
+  <w:num w:numId="4">
     <w:abstractNumId w:val="16"/>
   </w:num>
-  <w:num w:numId="5" w16cid:durableId="324014214">
+  <w:num w:numId="5">
     <w:abstractNumId w:val="10"/>
   </w:num>
-  <w:num w:numId="6" w16cid:durableId="335494951">
+  <w:num w:numId="6">
     <w:abstractNumId w:val="23"/>
   </w:num>
-  <w:num w:numId="7" w16cid:durableId="449982430">
+  <w:num w:numId="7">
     <w:abstractNumId w:val="22"/>
   </w:num>
-  <w:num w:numId="8" w16cid:durableId="1274439260">
+  <w:num w:numId="8">
     <w:abstractNumId w:val="3"/>
   </w:num>
-  <w:num w:numId="9" w16cid:durableId="1316765477">
+  <w:num w:numId="9">
     <w:abstractNumId w:val="6"/>
   </w:num>
-  <w:num w:numId="10" w16cid:durableId="680398829">
+  <w:num w:numId="10">
     <w:abstractNumId w:val="19"/>
   </w:num>
-  <w:num w:numId="11" w16cid:durableId="1367291997">
+  <w:num w:numId="11">
     <w:abstractNumId w:val="12"/>
   </w:num>
-  <w:num w:numId="12" w16cid:durableId="1416245118">
+  <w:num w:numId="12">
     <w:abstractNumId w:val="4"/>
   </w:num>
-  <w:num w:numId="13" w16cid:durableId="565527458">
+  <w:num w:numId="13">
     <w:abstractNumId w:val="14"/>
   </w:num>
-  <w:num w:numId="14" w16cid:durableId="1825778847">
+  <w:num w:numId="14">
     <w:abstractNumId w:val="9"/>
   </w:num>
-  <w:num w:numId="15" w16cid:durableId="345912758">
+  <w:num w:numId="15">
     <w:abstractNumId w:val="5"/>
   </w:num>
-  <w:num w:numId="16" w16cid:durableId="1865093526">
+  <w:num w:numId="16">
     <w:abstractNumId w:val="7"/>
   </w:num>
-  <w:num w:numId="17" w16cid:durableId="308678906">
+  <w:num w:numId="17">
     <w:abstractNumId w:val="27"/>
   </w:num>
-  <w:num w:numId="18" w16cid:durableId="682973544">
+  <w:num w:numId="18">
     <w:abstractNumId w:val="25"/>
   </w:num>
-  <w:num w:numId="19" w16cid:durableId="728262132">
+  <w:num w:numId="19">
     <w:abstractNumId w:val="13"/>
   </w:num>
-  <w:num w:numId="20" w16cid:durableId="1620335844">
+  <w:num w:numId="20">
     <w:abstractNumId w:val="17"/>
   </w:num>
-  <w:num w:numId="21" w16cid:durableId="1843928916">
+  <w:num w:numId="21">
     <w:abstractNumId w:val="18"/>
   </w:num>
-  <w:num w:numId="22" w16cid:durableId="1893690805">
+  <w:num w:numId="22">
     <w:abstractNumId w:val="2"/>
   </w:num>
-  <w:num w:numId="23" w16cid:durableId="284970442">
+  <w:num w:numId="23">
     <w:abstractNumId w:val="28"/>
   </w:num>
-  <w:num w:numId="24" w16cid:durableId="2031758862">
+  <w:num w:numId="24">
     <w:abstractNumId w:val="1"/>
   </w:num>
-  <w:num w:numId="25" w16cid:durableId="26377657">
+  <w:num w:numId="25">
     <w:abstractNumId w:val="20"/>
   </w:num>
-  <w:num w:numId="26" w16cid:durableId="306709306">
+  <w:num w:numId="26">
     <w:abstractNumId w:val="30"/>
   </w:num>
-  <w:num w:numId="27" w16cid:durableId="970748176">
+  <w:num w:numId="27">
     <w:abstractNumId w:val="29"/>
   </w:num>
-  <w:num w:numId="28" w16cid:durableId="2090075220">
+  <w:num w:numId="28">
     <w:abstractNumId w:val="21"/>
   </w:num>
-  <w:num w:numId="29" w16cid:durableId="500855462">
+  <w:num w:numId="29">
     <w:abstractNumId w:val="8"/>
   </w:num>
-  <w:num w:numId="30" w16cid:durableId="1835417553">
+  <w:num w:numId="30">
     <w:abstractNumId w:val="15"/>
   </w:num>
-  <w:num w:numId="31" w16cid:durableId="950018345">
+  <w:num w:numId="31">
     <w:abstractNumId w:val="24"/>
   </w:num>
 </w:numbering>
 </file>
 
 <file path=word/styles.xml><?xml version="1.0" encoding="utf-8"?>
-<w:styles xmlns:mc="http://schemas.openxmlformats.org/markup-compatibility/2006" xmlns:r="http://schemas.openxmlformats.org/officeDocument/2006/relationships" xmlns:w="http://schemas.openxmlformats.org/wordprocessingml/2006/main" xmlns:w14="http://schemas.microsoft.com/office/word/2010/wordml" xmlns:w15="http://schemas.microsoft.com/office/word/2012/wordml" xmlns:w16cex="http://schemas.microsoft.com/office/word/2018/wordml/cex" xmlns:w16cid="http://schemas.microsoft.com/office/word/2016/wordml/cid" xmlns:w16="http://schemas.microsoft.com/office/word/2018/wordml" xmlns:w16du="http://schemas.microsoft.com/office/word/2023/wordml/word16du" xmlns:w16sdtdh="http://schemas.microsoft.com/office/word/2020/wordml/sdtdatahash" xmlns:w16sdtfl="http://schemas.microsoft.com/office/word/2024/wordml/sdtformatlock" xmlns:w16se="http://schemas.microsoft.com/office/word/2015/wordml/symex" mc:Ignorable="w14 w15 w16se w16cid w16 w16cex w16sdtdh w16sdtfl w16du">
+<w:styles xmlns:mc="http://schemas.openxmlformats.org/markup-compatibility/2006" xmlns:r="http://schemas.openxmlformats.org/officeDocument/2006/relationships" xmlns:w="http://schemas.openxmlformats.org/wordprocessingml/2006/main" xmlns:w14="http://schemas.microsoft.com/office/word/2010/wordml" xmlns:w15="http://schemas.microsoft.com/office/word/2012/wordml" xmlns:w16cex="http://schemas.microsoft.com/office/word/2018/wordml/cex" xmlns:w16cid="http://schemas.microsoft.com/office/word/2016/wordml/cid" xmlns:w16="http://schemas.microsoft.com/office/word/2018/wordml" xmlns:w16sdtdh="http://schemas.microsoft.com/office/word/2020/wordml/sdtdatahash" xmlns:w16se="http://schemas.microsoft.com/office/word/2015/wordml/symex" mc:Ignorable="w14 w15 w16se w16cid w16 w16cex w16sdtdh">
   <w:docDefaults>
     <w:rPrDefault>
       <w:rPr>

</xml_diff>